<commit_message>
Nuovo sito (full new)
</commit_message>
<xml_diff>
--- a/Axsuma Website Build Planner.docx
+++ b/Axsuma Website Build Planner.docx
@@ -12,7 +12,6 @@
           <w:szCs w:val="32"/>
         </w:rPr>
       </w:pPr>
-      <w:proofErr w:type="spellStart"/>
       <w:r>
         <w:rPr>
           <w:rFonts w:ascii="Arial" w:hAnsi="Arial" w:cs="Arial"/>
@@ -21,18 +20,7 @@
           <w:sz w:val="32"/>
           <w:szCs w:val="32"/>
         </w:rPr>
-        <w:t>Axsuma</w:t>
-      </w:r>
-      <w:proofErr w:type="spellEnd"/>
-      <w:r>
-        <w:rPr>
-          <w:rFonts w:ascii="Arial" w:hAnsi="Arial" w:cs="Arial"/>
-          <w:b/>
-          <w:bCs/>
-          <w:sz w:val="32"/>
-          <w:szCs w:val="32"/>
-        </w:rPr>
-        <w:t xml:space="preserve"> Website Build Planner</w:t>
+        <w:t>Axsuma Website Build Planner</w:t>
       </w:r>
     </w:p>
     <w:p>
@@ -44,7 +32,7 @@
     </w:p>
     <w:tbl>
       <w:tblPr>
-        <w:tblStyle w:val="TableGrid"/>
+        <w:tblStyle w:val="Grigliatabella"/>
         <w:tblW w:w="21501" w:type="dxa"/>
         <w:tblLook w:val="04A0" w:firstRow="1" w:lastRow="0" w:firstColumn="1" w:lastColumn="0" w:noHBand="0" w:noVBand="1"/>
       </w:tblPr>
@@ -319,20 +307,8 @@
                 <w:sz w:val="20"/>
                 <w:szCs w:val="20"/>
               </w:rPr>
-              <w:t xml:space="preserve"> </w:t>
-            </w:r>
-            <w:proofErr w:type="spellStart"/>
-            <w:r>
-              <w:rPr>
-                <w:rFonts w:ascii="Arial" w:hAnsi="Arial" w:cs="Arial"/>
-                <w:b/>
-                <w:bCs/>
-                <w:sz w:val="20"/>
-                <w:szCs w:val="20"/>
-              </w:rPr>
-              <w:t>Axsuma</w:t>
-            </w:r>
-            <w:proofErr w:type="spellEnd"/>
+              <w:t xml:space="preserve"> Axsuma</w:t>
+            </w:r>
           </w:p>
         </w:tc>
         <w:tc>
@@ -407,23 +383,13 @@
                 <w:szCs w:val="20"/>
               </w:rPr>
             </w:pPr>
-            <w:proofErr w:type="spellStart"/>
-            <w:r>
-              <w:rPr>
-                <w:rFonts w:ascii="Arial" w:hAnsi="Arial" w:cs="Arial"/>
-                <w:sz w:val="20"/>
-                <w:szCs w:val="20"/>
-              </w:rPr>
-              <w:t>Axsuma</w:t>
-            </w:r>
-            <w:proofErr w:type="spellEnd"/>
-            <w:r>
-              <w:rPr>
-                <w:rFonts w:ascii="Arial" w:hAnsi="Arial" w:cs="Arial"/>
-                <w:sz w:val="20"/>
-                <w:szCs w:val="20"/>
-              </w:rPr>
-              <w:t xml:space="preserve"> </w:t>
+            <w:r>
+              <w:rPr>
+                <w:rFonts w:ascii="Arial" w:hAnsi="Arial" w:cs="Arial"/>
+                <w:sz w:val="20"/>
+                <w:szCs w:val="20"/>
+              </w:rPr>
+              <w:t xml:space="preserve">Axsuma </w:t>
             </w:r>
             <w:r>
               <w:rPr>
@@ -690,29 +656,7 @@
                 <w:sz w:val="20"/>
                 <w:szCs w:val="20"/>
               </w:rPr>
-              <w:t xml:space="preserve">Why Choose </w:t>
-            </w:r>
-            <w:proofErr w:type="spellStart"/>
-            <w:r>
-              <w:rPr>
-                <w:rFonts w:ascii="Arial" w:hAnsi="Arial" w:cs="Arial"/>
-                <w:b/>
-                <w:bCs/>
-                <w:sz w:val="20"/>
-                <w:szCs w:val="20"/>
-              </w:rPr>
-              <w:t>Axsuma</w:t>
-            </w:r>
-            <w:proofErr w:type="spellEnd"/>
-            <w:r>
-              <w:rPr>
-                <w:rFonts w:ascii="Arial" w:hAnsi="Arial" w:cs="Arial"/>
-                <w:b/>
-                <w:bCs/>
-                <w:sz w:val="20"/>
-                <w:szCs w:val="20"/>
-              </w:rPr>
-              <w:t>?</w:t>
+              <w:t>Why Choose Axsuma?</w:t>
             </w:r>
             <w:r>
               <w:rPr>
@@ -1193,10 +1137,11 @@
             <w:r>
               <w:rPr>
                 <w:rFonts w:ascii="Arial" w:hAnsi="Arial" w:cs="Arial"/>
-                <w:sz w:val="20"/>
-                <w:szCs w:val="20"/>
-              </w:rPr>
-              <w:object w:dxaOrig="1516" w:dyaOrig="989" w14:anchorId="51BD8C1D">
+                <w:noProof/>
+                <w:sz w:val="20"/>
+                <w:szCs w:val="20"/>
+              </w:rPr>
+              <w:object w:dxaOrig="1516" w:dyaOrig="989" w14:anchorId="73AE7145">
                 <v:shapetype id="_x0000_t75" coordsize="21600,21600" o:spt="75" o:preferrelative="t" path="m@4@5l@4@11@9@11@9@5xe" filled="f" stroked="f">
                   <v:stroke joinstyle="miter"/>
                   <v:formulas>
@@ -1216,10 +1161,10 @@
                   <v:path o:extrusionok="f" gradientshapeok="t" o:connecttype="rect"/>
                   <o:lock v:ext="edit" aspectratio="t"/>
                 </v:shapetype>
-                <v:shape id="_x0000_i1048" type="#_x0000_t75" style="width:76.2pt;height:49.4pt" o:ole="">
+                <v:shape id="_x0000_i1041" type="#_x0000_t75" alt="" style="width:75.95pt;height:49.05pt;mso-width-percent:0;mso-height-percent:0;mso-width-percent:0;mso-height-percent:0" o:ole="">
                   <v:imagedata r:id="rId8" o:title=""/>
                 </v:shape>
-                <o:OLEObject Type="Embed" ProgID="Word.Document.12" ShapeID="_x0000_i1048" DrawAspect="Icon" ObjectID="_1837339779" r:id="rId9">
+                <o:OLEObject Type="Embed" ProgID="Word.Document.12" ShapeID="_x0000_i1041" DrawAspect="Icon" ObjectID="_1837707155" r:id="rId9">
                   <o:FieldCodes>\s</o:FieldCodes>
                 </o:OLEObject>
               </w:object>
@@ -1229,14 +1174,15 @@
             <w:r>
               <w:rPr>
                 <w:rFonts w:ascii="Arial" w:hAnsi="Arial" w:cs="Arial"/>
-                <w:sz w:val="20"/>
-                <w:szCs w:val="20"/>
-              </w:rPr>
-              <w:object w:dxaOrig="1516" w:dyaOrig="989" w14:anchorId="1B4A554A">
-                <v:shape id="_x0000_i1049" type="#_x0000_t75" style="width:76.2pt;height:49.4pt" o:ole="">
+                <w:noProof/>
+                <w:sz w:val="20"/>
+                <w:szCs w:val="20"/>
+              </w:rPr>
+              <w:object w:dxaOrig="1516" w:dyaOrig="989" w14:anchorId="66F8CB96">
+                <v:shape id="_x0000_i1040" type="#_x0000_t75" alt="" style="width:75.95pt;height:49.05pt;mso-width-percent:0;mso-height-percent:0;mso-width-percent:0;mso-height-percent:0" o:ole="">
                   <v:imagedata r:id="rId10" o:title=""/>
                 </v:shape>
-                <o:OLEObject Type="Embed" ProgID="Word.Document.12" ShapeID="_x0000_i1049" DrawAspect="Icon" ObjectID="_1837339780" r:id="rId11">
+                <o:OLEObject Type="Embed" ProgID="Word.Document.12" ShapeID="_x0000_i1040" DrawAspect="Icon" ObjectID="_1837707156" r:id="rId11">
                   <o:FieldCodes>\s</o:FieldCodes>
                 </o:OLEObject>
               </w:object>
@@ -1246,14 +1192,15 @@
             <w:r>
               <w:rPr>
                 <w:rFonts w:ascii="Arial" w:hAnsi="Arial" w:cs="Arial"/>
-                <w:sz w:val="20"/>
-                <w:szCs w:val="20"/>
-              </w:rPr>
-              <w:object w:dxaOrig="1516" w:dyaOrig="989" w14:anchorId="58FC0B00">
-                <v:shape id="_x0000_i1066" type="#_x0000_t75" style="width:76.2pt;height:49.4pt" o:ole="">
+                <w:noProof/>
+                <w:sz w:val="20"/>
+                <w:szCs w:val="20"/>
+              </w:rPr>
+              <w:object w:dxaOrig="1516" w:dyaOrig="989" w14:anchorId="07812E02">
+                <v:shape id="_x0000_i1039" type="#_x0000_t75" alt="" style="width:75.95pt;height:49.05pt;mso-width-percent:0;mso-height-percent:0;mso-width-percent:0;mso-height-percent:0" o:ole="">
                   <v:imagedata r:id="rId12" o:title=""/>
                 </v:shape>
-                <o:OLEObject Type="Embed" ProgID="Word.Document.12" ShapeID="_x0000_i1066" DrawAspect="Icon" ObjectID="_1837339781" r:id="rId13">
+                <o:OLEObject Type="Embed" ProgID="Word.Document.12" ShapeID="_x0000_i1039" DrawAspect="Icon" ObjectID="_1837707157" r:id="rId13">
                   <o:FieldCodes>\s</o:FieldCodes>
                 </o:OLEObject>
               </w:object>
@@ -1263,14 +1210,15 @@
             <w:r>
               <w:rPr>
                 <w:rFonts w:ascii="Arial" w:hAnsi="Arial" w:cs="Arial"/>
-                <w:sz w:val="20"/>
-                <w:szCs w:val="20"/>
-              </w:rPr>
-              <w:object w:dxaOrig="1516" w:dyaOrig="989" w14:anchorId="71B66096">
-                <v:shape id="_x0000_i1051" type="#_x0000_t75" style="width:76.2pt;height:49.4pt" o:ole="">
+                <w:noProof/>
+                <w:sz w:val="20"/>
+                <w:szCs w:val="20"/>
+              </w:rPr>
+              <w:object w:dxaOrig="1516" w:dyaOrig="989" w14:anchorId="3482DF03">
+                <v:shape id="_x0000_i1038" type="#_x0000_t75" alt="" style="width:75.95pt;height:49.05pt;mso-width-percent:0;mso-height-percent:0;mso-width-percent:0;mso-height-percent:0" o:ole="">
                   <v:imagedata r:id="rId14" o:title=""/>
                 </v:shape>
-                <o:OLEObject Type="Embed" ProgID="Word.Document.12" ShapeID="_x0000_i1051" DrawAspect="Icon" ObjectID="_1837339782" r:id="rId15">
+                <o:OLEObject Type="Embed" ProgID="Word.Document.12" ShapeID="_x0000_i1038" DrawAspect="Icon" ObjectID="_1837707158" r:id="rId15">
                   <o:FieldCodes>\s</o:FieldCodes>
                 </o:OLEObject>
               </w:object>
@@ -1280,14 +1228,15 @@
             <w:r>
               <w:rPr>
                 <w:rFonts w:ascii="Arial" w:hAnsi="Arial" w:cs="Arial"/>
-                <w:sz w:val="20"/>
-                <w:szCs w:val="20"/>
-              </w:rPr>
-              <w:object w:dxaOrig="1516" w:dyaOrig="989" w14:anchorId="2A942E18">
-                <v:shape id="_x0000_i1052" type="#_x0000_t75" style="width:76.2pt;height:49.4pt" o:ole="">
+                <w:noProof/>
+                <w:sz w:val="20"/>
+                <w:szCs w:val="20"/>
+              </w:rPr>
+              <w:object w:dxaOrig="1516" w:dyaOrig="989" w14:anchorId="095AE729">
+                <v:shape id="_x0000_i1037" type="#_x0000_t75" alt="" style="width:75.95pt;height:49.05pt;mso-width-percent:0;mso-height-percent:0;mso-width-percent:0;mso-height-percent:0" o:ole="">
                   <v:imagedata r:id="rId16" o:title=""/>
                 </v:shape>
-                <o:OLEObject Type="Embed" ProgID="Word.Document.12" ShapeID="_x0000_i1052" DrawAspect="Icon" ObjectID="_1837339783" r:id="rId17">
+                <o:OLEObject Type="Embed" ProgID="Word.Document.12" ShapeID="_x0000_i1037" DrawAspect="Icon" ObjectID="_1837707159" r:id="rId17">
                   <o:FieldCodes>\s</o:FieldCodes>
                 </o:OLEObject>
               </w:object>
@@ -1297,14 +1246,15 @@
             <w:r>
               <w:rPr>
                 <w:rFonts w:ascii="Arial" w:hAnsi="Arial" w:cs="Arial"/>
-                <w:sz w:val="20"/>
-                <w:szCs w:val="20"/>
-              </w:rPr>
-              <w:object w:dxaOrig="1516" w:dyaOrig="989" w14:anchorId="673CE5D3">
-                <v:shape id="_x0000_i1053" type="#_x0000_t75" style="width:76.2pt;height:49.4pt" o:ole="">
+                <w:noProof/>
+                <w:sz w:val="20"/>
+                <w:szCs w:val="20"/>
+              </w:rPr>
+              <w:object w:dxaOrig="1516" w:dyaOrig="989" w14:anchorId="6671CBC0">
+                <v:shape id="_x0000_i1036" type="#_x0000_t75" alt="" style="width:75.95pt;height:49.05pt;mso-width-percent:0;mso-height-percent:0;mso-width-percent:0;mso-height-percent:0" o:ole="">
                   <v:imagedata r:id="rId18" o:title=""/>
                 </v:shape>
-                <o:OLEObject Type="Embed" ProgID="Word.Document.12" ShapeID="_x0000_i1053" DrawAspect="Icon" ObjectID="_1837339784" r:id="rId19">
+                <o:OLEObject Type="Embed" ProgID="Word.Document.12" ShapeID="_x0000_i1036" DrawAspect="Icon" ObjectID="_1837707160" r:id="rId19">
                   <o:FieldCodes>\s</o:FieldCodes>
                 </o:OLEObject>
               </w:object>
@@ -1894,14 +1844,15 @@
             <w:r>
               <w:rPr>
                 <w:rFonts w:ascii="Arial" w:hAnsi="Arial" w:cs="Arial"/>
-                <w:sz w:val="20"/>
-                <w:szCs w:val="20"/>
-              </w:rPr>
-              <w:object w:dxaOrig="1516" w:dyaOrig="989" w14:anchorId="69365943">
-                <v:shape id="_x0000_i1025" type="#_x0000_t75" style="width:75.35pt;height:49.4pt" o:ole="">
+                <w:noProof/>
+                <w:sz w:val="20"/>
+                <w:szCs w:val="20"/>
+              </w:rPr>
+              <w:object w:dxaOrig="1516" w:dyaOrig="989" w14:anchorId="2CC92E2D">
+                <v:shape id="_x0000_i1035" type="#_x0000_t75" alt="" style="width:75.15pt;height:49.05pt;mso-width-percent:0;mso-height-percent:0;mso-width-percent:0;mso-height-percent:0" o:ole="">
                   <v:imagedata r:id="rId20" o:title=""/>
                 </v:shape>
-                <o:OLEObject Type="Embed" ProgID="Word.Document.12" ShapeID="_x0000_i1025" DrawAspect="Icon" ObjectID="_1837339785" r:id="rId21">
+                <o:OLEObject Type="Embed" ProgID="Word.Document.12" ShapeID="_x0000_i1035" DrawAspect="Icon" ObjectID="_1837707161" r:id="rId21">
                   <o:FieldCodes>\s</o:FieldCodes>
                 </o:OLEObject>
               </w:object>
@@ -2341,25 +2292,7 @@
                 <w:szCs w:val="20"/>
               </w:rPr>
               <w:br/>
-              <w:t xml:space="preserve">Every company must have a registered office for statutory notices and legal correspondence. </w:t>
-            </w:r>
-            <w:proofErr w:type="spellStart"/>
-            <w:r>
-              <w:rPr>
-                <w:rFonts w:ascii="Arial" w:hAnsi="Arial" w:cs="Arial"/>
-                <w:sz w:val="20"/>
-                <w:szCs w:val="20"/>
-              </w:rPr>
-              <w:t>Axsuma</w:t>
-            </w:r>
-            <w:proofErr w:type="spellEnd"/>
-            <w:r>
-              <w:rPr>
-                <w:rFonts w:ascii="Arial" w:hAnsi="Arial" w:cs="Arial"/>
-                <w:sz w:val="20"/>
-                <w:szCs w:val="20"/>
-              </w:rPr>
-              <w:t xml:space="preserve"> provides a prestigious London address </w:t>
+              <w:t xml:space="preserve">Every company must have a registered office for statutory notices and legal correspondence. Axsuma provides a prestigious London address </w:t>
             </w:r>
             <w:r>
               <w:rPr>
@@ -2433,25 +2366,7 @@
                 <w:szCs w:val="20"/>
               </w:rPr>
               <w:br/>
-              <w:t xml:space="preserve">If your company is currently managed by another provider, </w:t>
-            </w:r>
-            <w:proofErr w:type="spellStart"/>
-            <w:r>
-              <w:rPr>
-                <w:rFonts w:ascii="Arial" w:hAnsi="Arial" w:cs="Arial"/>
-                <w:sz w:val="20"/>
-                <w:szCs w:val="20"/>
-              </w:rPr>
-              <w:t>Axsuma</w:t>
-            </w:r>
-            <w:proofErr w:type="spellEnd"/>
-            <w:r>
-              <w:rPr>
-                <w:rFonts w:ascii="Arial" w:hAnsi="Arial" w:cs="Arial"/>
-                <w:sz w:val="20"/>
-                <w:szCs w:val="20"/>
-              </w:rPr>
-              <w:t xml:space="preserve"> can seamlessly take over company secretarial support. We coordinate the transition, retrieve all statutory information, verify register accuracy, identify pending filings, and assume responsibility for ongoing governance and compliance.</w:t>
+              <w:t>If your company is currently managed by another provider, Axsuma can seamlessly take over company secretarial support. We coordinate the transition, retrieve all statutory information, verify register accuracy, identify pending filings, and assume responsibility for ongoing governance and compliance.</w:t>
             </w:r>
           </w:p>
           <w:p>
@@ -2711,7 +2626,7 @@
           </w:p>
           <w:p>
             <w:pPr>
-              <w:pStyle w:val="BodyText"/>
+              <w:pStyle w:val="Corpotesto"/>
               <w:spacing w:before="105"/>
               <w:rPr>
                 <w:rFonts w:eastAsiaTheme="minorHAnsi"/>
@@ -2740,7 +2655,7 @@
           </w:p>
           <w:p>
             <w:pPr>
-              <w:pStyle w:val="BodyText"/>
+              <w:pStyle w:val="Corpotesto"/>
               <w:rPr>
                 <w:b/>
                 <w:bCs/>
@@ -2753,7 +2668,7 @@
           </w:p>
           <w:p>
             <w:pPr>
-              <w:pStyle w:val="BodyText"/>
+              <w:pStyle w:val="Corpotesto"/>
               <w:rPr>
                 <w:lang w:val="en-GB"/>
               </w:rPr>
@@ -2778,7 +2693,7 @@
           </w:p>
           <w:p>
             <w:pPr>
-              <w:pStyle w:val="BodyText"/>
+              <w:pStyle w:val="Corpotesto"/>
               <w:rPr>
                 <w:sz w:val="20"/>
                 <w:szCs w:val="20"/>
@@ -2964,7 +2879,7 @@
           </w:p>
           <w:p>
             <w:pPr>
-              <w:pStyle w:val="BodyText"/>
+              <w:pStyle w:val="Corpotesto"/>
               <w:rPr>
                 <w:sz w:val="20"/>
                 <w:szCs w:val="20"/>
@@ -2974,48 +2889,161 @@
           </w:p>
           <w:p>
             <w:pPr>
-              <w:pStyle w:val="BodyText"/>
-              <w:rPr>
-                <w:sz w:val="20"/>
-                <w:szCs w:val="20"/>
-              </w:rPr>
-            </w:pPr>
-            <w:proofErr w:type="spellStart"/>
+              <w:pStyle w:val="Corpotesto"/>
+              <w:rPr>
+                <w:sz w:val="20"/>
+                <w:szCs w:val="20"/>
+              </w:rPr>
+            </w:pPr>
             <w:r>
               <w:rPr>
                 <w:sz w:val="20"/>
                 <w:szCs w:val="20"/>
                 <w:lang w:val="en-GB"/>
               </w:rPr>
-              <w:t>Axsuma</w:t>
-            </w:r>
-            <w:proofErr w:type="spellEnd"/>
-            <w:r>
-              <w:rPr>
-                <w:sz w:val="20"/>
-                <w:szCs w:val="20"/>
+              <w:t>Axsuma streamlines the process. We support lawyers, corporates, and private equity firms with pre-established corporate structures purpose-built for fast-moving M&amp;A, restructuring, and carve-outs. We handle the essential administrative groundwork, providing the speed and structural certainty required to close the deal. Beyond completion, we ensure all entities remain fully compliant across their regulatory, accounting, tax, and payroll obligations.</w:t>
+            </w:r>
+          </w:p>
+          <w:p>
+            <w:pPr>
+              <w:pStyle w:val="Corpotesto"/>
+              <w:rPr>
                 <w:lang w:val="en-GB"/>
               </w:rPr>
-              <w:t xml:space="preserve"> streamlines the process. We support lawyers, corporates, and private equity firms with pre-established corporate structures purpose-built for fast-moving M&amp;A, restructuring, and carve-outs. We handle the essential administrative groundwork, providing the speed and structural certainty required to close the deal. Beyond completion, we ensure all entities remain fully compliant across their regulatory, accounting, tax, and payroll obligations.</w:t>
-            </w:r>
-          </w:p>
-          <w:p>
-            <w:pPr>
-              <w:pStyle w:val="BodyText"/>
-              <w:rPr>
+            </w:pPr>
+          </w:p>
+          <w:p>
+            <w:pPr>
+              <w:pStyle w:val="Corpotesto"/>
+              <w:rPr>
+                <w:b/>
+                <w:bCs/>
+                <w:color w:val="00B050"/>
+                <w:sz w:val="20"/>
+                <w:szCs w:val="20"/>
+              </w:rPr>
+            </w:pPr>
+            <w:r>
+              <w:rPr>
+                <w:b/>
+                <w:bCs/>
+                <w:color w:val="00B050"/>
+                <w:sz w:val="20"/>
+                <w:szCs w:val="20"/>
+              </w:rPr>
+              <w:t>Transaction-Ready Corporate Stacks</w:t>
+            </w:r>
+          </w:p>
+          <w:p>
+            <w:pPr>
+              <w:pStyle w:val="Corpotesto"/>
+              <w:rPr>
+                <w:b/>
+                <w:bCs/>
+                <w:color w:val="00B050"/>
+                <w:sz w:val="20"/>
+                <w:szCs w:val="20"/>
+              </w:rPr>
+            </w:pPr>
+          </w:p>
+          <w:p>
+            <w:pPr>
+              <w:pStyle w:val="Corpotesto"/>
+              <w:rPr>
+                <w:b/>
+                <w:bCs/>
+                <w:color w:val="00B050"/>
+                <w:sz w:val="20"/>
+                <w:szCs w:val="20"/>
+              </w:rPr>
+            </w:pPr>
+            <w:r>
+              <w:rPr>
+                <w:b/>
+                <w:bCs/>
+                <w:color w:val="00B050"/>
+                <w:sz w:val="20"/>
+                <w:szCs w:val="20"/>
+              </w:rPr>
+              <w:t>Accelerate deal execution with pre-established structures.</w:t>
+            </w:r>
+          </w:p>
+          <w:p>
+            <w:pPr>
+              <w:pStyle w:val="Corpotesto"/>
+              <w:rPr>
+                <w:b/>
+                <w:bCs/>
+                <w:color w:val="00B050"/>
+                <w:sz w:val="20"/>
+                <w:szCs w:val="20"/>
+              </w:rPr>
+            </w:pPr>
+          </w:p>
+          <w:p>
+            <w:pPr>
+              <w:pStyle w:val="Corpotesto"/>
+              <w:rPr>
+                <w:sz w:val="20"/>
+                <w:szCs w:val="20"/>
                 <w:lang w:val="en-GB"/>
               </w:rPr>
             </w:pPr>
-          </w:p>
-          <w:p>
-            <w:pPr>
-              <w:pStyle w:val="BodyText"/>
-              <w:rPr>
-                <w:b/>
-                <w:bCs/>
+            <w:r>
+              <w:rPr>
+                <w:sz w:val="20"/>
+                <w:szCs w:val="20"/>
+                <w:lang w:val="en-GB"/>
+              </w:rPr>
+              <w:t>Delays in entity formation, governance setup, or appointing directors can create unnecessary friction during sensitive deal phases. Our solution eliminates these risks.</w:t>
+            </w:r>
+          </w:p>
+          <w:p>
+            <w:pPr>
+              <w:pStyle w:val="Corpotesto"/>
+              <w:rPr>
+                <w:sz w:val="20"/>
+                <w:szCs w:val="20"/>
+                <w:lang w:val="en-GB"/>
+              </w:rPr>
+            </w:pPr>
+          </w:p>
+          <w:p>
+            <w:pPr>
+              <w:pStyle w:val="Corpotesto"/>
+              <w:rPr>
+                <w:sz w:val="20"/>
+                <w:szCs w:val="20"/>
+                <w:lang w:val="en-GB"/>
+              </w:rPr>
+            </w:pPr>
+            <w:r>
+              <w:rPr>
+                <w:sz w:val="20"/>
+                <w:szCs w:val="20"/>
+                <w:lang w:val="en-GB"/>
+              </w:rPr>
+              <w:t>We offer ready-made HoldCo, MidCo, and BidCo entities available for immediate reservation. These structures are securely held to order exclusively for law firms and advisors, allowing you to focus on deal structuring and negotiation without administrative bottlenecks.</w:t>
+            </w:r>
+          </w:p>
+          <w:p>
+            <w:pPr>
+              <w:pStyle w:val="Corpotesto"/>
+              <w:rPr>
+                <w:sz w:val="20"/>
+                <w:szCs w:val="20"/>
+                <w:lang w:val="en-GB"/>
+              </w:rPr>
+            </w:pPr>
+          </w:p>
+          <w:p>
+            <w:pPr>
+              <w:pStyle w:val="Corpotesto"/>
+              <w:rPr>
                 <w:color w:val="00B050"/>
                 <w:sz w:val="20"/>
                 <w:szCs w:val="20"/>
+                <w:lang w:val="en-GB"/>
               </w:rPr>
             </w:pPr>
             <w:r>
@@ -3025,219 +3053,42 @@
                 <w:color w:val="00B050"/>
                 <w:sz w:val="20"/>
                 <w:szCs w:val="20"/>
-              </w:rPr>
-              <w:t>Transaction-Ready Corporate Stacks</w:t>
-            </w:r>
-          </w:p>
-          <w:p>
-            <w:pPr>
-              <w:pStyle w:val="BodyText"/>
-              <w:rPr>
-                <w:b/>
-                <w:bCs/>
-                <w:color w:val="00B050"/>
-                <w:sz w:val="20"/>
-                <w:szCs w:val="20"/>
-              </w:rPr>
-            </w:pPr>
-          </w:p>
-          <w:p>
-            <w:pPr>
-              <w:pStyle w:val="BodyText"/>
-              <w:rPr>
-                <w:b/>
-                <w:bCs/>
-                <w:color w:val="00B050"/>
-                <w:sz w:val="20"/>
-                <w:szCs w:val="20"/>
-              </w:rPr>
-            </w:pPr>
-            <w:r>
-              <w:rPr>
-                <w:b/>
-                <w:bCs/>
-                <w:color w:val="00B050"/>
-                <w:sz w:val="20"/>
-                <w:szCs w:val="20"/>
-              </w:rPr>
-              <w:t>Accelerate deal execution with pre-established structures.</w:t>
-            </w:r>
-          </w:p>
-          <w:p>
-            <w:pPr>
-              <w:pStyle w:val="BodyText"/>
-              <w:rPr>
-                <w:b/>
-                <w:bCs/>
-                <w:color w:val="00B050"/>
-                <w:sz w:val="20"/>
-                <w:szCs w:val="20"/>
-              </w:rPr>
-            </w:pPr>
-          </w:p>
-          <w:p>
-            <w:pPr>
-              <w:pStyle w:val="BodyText"/>
-              <w:rPr>
-                <w:sz w:val="20"/>
-                <w:szCs w:val="20"/>
                 <w:lang w:val="en-GB"/>
               </w:rPr>
-            </w:pPr>
-            <w:r>
+              <w:t>The Ready-Made Corporate Stack</w:t>
+            </w:r>
+          </w:p>
+          <w:p>
+            <w:pPr>
+              <w:pStyle w:val="Corpotesto"/>
               <w:rPr>
                 <w:sz w:val="20"/>
                 <w:szCs w:val="20"/>
                 <w:lang w:val="en-GB"/>
               </w:rPr>
-              <w:t>Delays in entity formation, governance setup, or appointing directors can create unnecessary friction during sensitive deal phases. Our solution eliminates these risks.</w:t>
-            </w:r>
-          </w:p>
-          <w:p>
-            <w:pPr>
-              <w:pStyle w:val="BodyText"/>
+            </w:pPr>
+            <w:r>
               <w:rPr>
                 <w:sz w:val="20"/>
                 <w:szCs w:val="20"/>
                 <w:lang w:val="en-GB"/>
               </w:rPr>
-            </w:pPr>
-          </w:p>
-          <w:p>
-            <w:pPr>
-              <w:pStyle w:val="BodyText"/>
+              <w:t>Our fully aligned three-tier acquisition structure is configurable to specific transaction requirements. All entities are established with clean corporate records, dormant status, and are maintained in good standing.</w:t>
+            </w:r>
+          </w:p>
+          <w:p>
+            <w:pPr>
+              <w:pStyle w:val="Corpotesto"/>
               <w:rPr>
                 <w:sz w:val="20"/>
                 <w:szCs w:val="20"/>
                 <w:lang w:val="en-GB"/>
               </w:rPr>
             </w:pPr>
-            <w:r>
-              <w:rPr>
-                <w:sz w:val="20"/>
-                <w:szCs w:val="20"/>
-                <w:lang w:val="en-GB"/>
-              </w:rPr>
-              <w:t xml:space="preserve">We offer ready-made </w:t>
-            </w:r>
-            <w:proofErr w:type="spellStart"/>
-            <w:r>
-              <w:rPr>
-                <w:sz w:val="20"/>
-                <w:szCs w:val="20"/>
-                <w:lang w:val="en-GB"/>
-              </w:rPr>
-              <w:t>HoldCo</w:t>
-            </w:r>
-            <w:proofErr w:type="spellEnd"/>
-            <w:r>
-              <w:rPr>
-                <w:sz w:val="20"/>
-                <w:szCs w:val="20"/>
-                <w:lang w:val="en-GB"/>
-              </w:rPr>
-              <w:t xml:space="preserve">, </w:t>
-            </w:r>
-            <w:proofErr w:type="spellStart"/>
-            <w:r>
-              <w:rPr>
-                <w:sz w:val="20"/>
-                <w:szCs w:val="20"/>
-                <w:lang w:val="en-GB"/>
-              </w:rPr>
-              <w:t>MidCo</w:t>
-            </w:r>
-            <w:proofErr w:type="spellEnd"/>
-            <w:r>
-              <w:rPr>
-                <w:sz w:val="20"/>
-                <w:szCs w:val="20"/>
-                <w:lang w:val="en-GB"/>
-              </w:rPr>
-              <w:t xml:space="preserve">, and </w:t>
-            </w:r>
-            <w:proofErr w:type="spellStart"/>
-            <w:r>
-              <w:rPr>
-                <w:sz w:val="20"/>
-                <w:szCs w:val="20"/>
-                <w:lang w:val="en-GB"/>
-              </w:rPr>
-              <w:t>BidCo</w:t>
-            </w:r>
-            <w:proofErr w:type="spellEnd"/>
-            <w:r>
-              <w:rPr>
-                <w:sz w:val="20"/>
-                <w:szCs w:val="20"/>
-                <w:lang w:val="en-GB"/>
-              </w:rPr>
-              <w:t xml:space="preserve"> entities available for immediate reservation. These structures are securely held to order exclusively for law firms and advisors, allowing you to focus on deal structuring and negotiation without administrative bottlenecks.</w:t>
-            </w:r>
-          </w:p>
-          <w:p>
-            <w:pPr>
-              <w:pStyle w:val="BodyText"/>
-              <w:rPr>
-                <w:sz w:val="20"/>
-                <w:szCs w:val="20"/>
-                <w:lang w:val="en-GB"/>
-              </w:rPr>
-            </w:pPr>
-          </w:p>
-          <w:p>
-            <w:pPr>
-              <w:pStyle w:val="BodyText"/>
-              <w:rPr>
-                <w:color w:val="00B050"/>
-                <w:sz w:val="20"/>
-                <w:szCs w:val="20"/>
-                <w:lang w:val="en-GB"/>
-              </w:rPr>
-            </w:pPr>
-            <w:r>
-              <w:rPr>
-                <w:b/>
-                <w:bCs/>
-                <w:color w:val="00B050"/>
-                <w:sz w:val="20"/>
-                <w:szCs w:val="20"/>
-                <w:lang w:val="en-GB"/>
-              </w:rPr>
-              <w:t>The Ready-Made Corporate Stack</w:t>
-            </w:r>
-          </w:p>
-          <w:p>
-            <w:pPr>
-              <w:pStyle w:val="BodyText"/>
-              <w:rPr>
-                <w:sz w:val="20"/>
-                <w:szCs w:val="20"/>
-                <w:lang w:val="en-GB"/>
-              </w:rPr>
-            </w:pPr>
-            <w:r>
-              <w:rPr>
-                <w:sz w:val="20"/>
-                <w:szCs w:val="20"/>
-                <w:lang w:val="en-GB"/>
-              </w:rPr>
-              <w:t>Our fully aligned three-tier acquisition structure is configurable to specific transaction requirements. All entities are established with clean corporate records, dormant status, and are maintained in good standing.</w:t>
-            </w:r>
-          </w:p>
-          <w:p>
-            <w:pPr>
-              <w:pStyle w:val="BodyText"/>
-              <w:rPr>
-                <w:sz w:val="20"/>
-                <w:szCs w:val="20"/>
-                <w:lang w:val="en-GB"/>
-              </w:rPr>
-            </w:pPr>
-          </w:p>
-          <w:p>
-            <w:pPr>
-              <w:pStyle w:val="BodyText"/>
+          </w:p>
+          <w:p>
+            <w:pPr>
+              <w:pStyle w:val="Corpotesto"/>
               <w:numPr>
                 <w:ilvl w:val="0"/>
                 <w:numId w:val="15"/>
@@ -3247,25 +3098,14 @@
                 <w:szCs w:val="20"/>
               </w:rPr>
             </w:pPr>
-            <w:proofErr w:type="spellStart"/>
-            <w:r>
-              <w:rPr>
-                <w:b/>
-                <w:bCs/>
-                <w:sz w:val="20"/>
-                <w:szCs w:val="20"/>
-              </w:rPr>
-              <w:t>HoldCo</w:t>
-            </w:r>
-            <w:proofErr w:type="spellEnd"/>
-            <w:r>
-              <w:rPr>
-                <w:b/>
-                <w:bCs/>
-                <w:sz w:val="20"/>
-                <w:szCs w:val="20"/>
-              </w:rPr>
-              <w:t>:</w:t>
+            <w:r>
+              <w:rPr>
+                <w:b/>
+                <w:bCs/>
+                <w:sz w:val="20"/>
+                <w:szCs w:val="20"/>
+              </w:rPr>
+              <w:t>HoldCo:</w:t>
             </w:r>
             <w:r>
               <w:rPr>
@@ -3291,7 +3131,7 @@
           </w:p>
           <w:p>
             <w:pPr>
-              <w:pStyle w:val="BodyText"/>
+              <w:pStyle w:val="Corpotesto"/>
               <w:ind w:left="720"/>
               <w:rPr>
                 <w:sz w:val="20"/>
@@ -3301,7 +3141,7 @@
           </w:p>
           <w:p>
             <w:pPr>
-              <w:pStyle w:val="BodyText"/>
+              <w:pStyle w:val="Corpotesto"/>
               <w:numPr>
                 <w:ilvl w:val="0"/>
                 <w:numId w:val="15"/>
@@ -3311,25 +3151,14 @@
                 <w:szCs w:val="20"/>
               </w:rPr>
             </w:pPr>
-            <w:proofErr w:type="spellStart"/>
-            <w:r>
-              <w:rPr>
-                <w:b/>
-                <w:bCs/>
-                <w:sz w:val="20"/>
-                <w:szCs w:val="20"/>
-              </w:rPr>
-              <w:t>MidCo</w:t>
-            </w:r>
-            <w:proofErr w:type="spellEnd"/>
-            <w:r>
-              <w:rPr>
-                <w:b/>
-                <w:bCs/>
-                <w:sz w:val="20"/>
-                <w:szCs w:val="20"/>
-              </w:rPr>
-              <w:t>:</w:t>
+            <w:r>
+              <w:rPr>
+                <w:b/>
+                <w:bCs/>
+                <w:sz w:val="20"/>
+                <w:szCs w:val="20"/>
+              </w:rPr>
+              <w:t>MidCo:</w:t>
             </w:r>
             <w:r>
               <w:rPr>
@@ -3355,7 +3184,7 @@
           </w:p>
           <w:p>
             <w:pPr>
-              <w:pStyle w:val="BodyText"/>
+              <w:pStyle w:val="Corpotesto"/>
               <w:ind w:left="720"/>
               <w:rPr>
                 <w:sz w:val="20"/>
@@ -3365,7 +3194,7 @@
           </w:p>
           <w:p>
             <w:pPr>
-              <w:pStyle w:val="BodyText"/>
+              <w:pStyle w:val="Corpotesto"/>
               <w:numPr>
                 <w:ilvl w:val="0"/>
                 <w:numId w:val="15"/>
@@ -3375,25 +3204,14 @@
                 <w:szCs w:val="20"/>
               </w:rPr>
             </w:pPr>
-            <w:proofErr w:type="spellStart"/>
-            <w:r>
-              <w:rPr>
-                <w:b/>
-                <w:bCs/>
-                <w:sz w:val="20"/>
-                <w:szCs w:val="20"/>
-              </w:rPr>
-              <w:t>BidCo</w:t>
-            </w:r>
-            <w:proofErr w:type="spellEnd"/>
-            <w:r>
-              <w:rPr>
-                <w:b/>
-                <w:bCs/>
-                <w:sz w:val="20"/>
-                <w:szCs w:val="20"/>
-              </w:rPr>
-              <w:t>:</w:t>
+            <w:r>
+              <w:rPr>
+                <w:b/>
+                <w:bCs/>
+                <w:sz w:val="20"/>
+                <w:szCs w:val="20"/>
+              </w:rPr>
+              <w:t>BidCo:</w:t>
             </w:r>
             <w:r>
               <w:rPr>
@@ -3435,7 +3253,7 @@
           </w:p>
           <w:p>
             <w:pPr>
-              <w:pStyle w:val="BodyText"/>
+              <w:pStyle w:val="Corpotesto"/>
               <w:rPr>
                 <w:sz w:val="20"/>
                 <w:szCs w:val="20"/>
@@ -3453,7 +3271,7 @@
           </w:p>
           <w:p>
             <w:pPr>
-              <w:pStyle w:val="BodyText"/>
+              <w:pStyle w:val="Corpotesto"/>
               <w:rPr>
                 <w:sz w:val="20"/>
                 <w:szCs w:val="20"/>
@@ -3463,7 +3281,7 @@
           </w:p>
           <w:p>
             <w:pPr>
-              <w:pStyle w:val="BodyText"/>
+              <w:pStyle w:val="Corpotesto"/>
               <w:rPr>
                 <w:b/>
                 <w:bCs/>
@@ -3509,7 +3327,7 @@
           </w:p>
           <w:p>
             <w:pPr>
-              <w:pStyle w:val="BodyText"/>
+              <w:pStyle w:val="Corpotesto"/>
               <w:rPr>
                 <w:color w:val="00B050"/>
                 <w:sz w:val="20"/>
@@ -3520,7 +3338,7 @@
           </w:p>
           <w:p>
             <w:pPr>
-              <w:pStyle w:val="BodyText"/>
+              <w:pStyle w:val="Corpotesto"/>
               <w:numPr>
                 <w:ilvl w:val="0"/>
                 <w:numId w:val="16"/>
@@ -3560,7 +3378,7 @@
           </w:p>
           <w:p>
             <w:pPr>
-              <w:pStyle w:val="BodyText"/>
+              <w:pStyle w:val="Corpotesto"/>
               <w:ind w:left="720"/>
               <w:rPr>
                 <w:sz w:val="20"/>
@@ -3571,7 +3389,7 @@
           </w:p>
           <w:p>
             <w:pPr>
-              <w:pStyle w:val="BodyText"/>
+              <w:pStyle w:val="Corpotesto"/>
               <w:numPr>
                 <w:ilvl w:val="0"/>
                 <w:numId w:val="16"/>
@@ -3644,7 +3462,7 @@
           </w:p>
           <w:p>
             <w:pPr>
-              <w:pStyle w:val="BodyText"/>
+              <w:pStyle w:val="Corpotesto"/>
               <w:rPr>
                 <w:sz w:val="20"/>
                 <w:szCs w:val="20"/>
@@ -3654,7 +3472,7 @@
           </w:p>
           <w:p>
             <w:pPr>
-              <w:pStyle w:val="BodyText"/>
+              <w:pStyle w:val="Corpotesto"/>
               <w:numPr>
                 <w:ilvl w:val="0"/>
                 <w:numId w:val="16"/>
@@ -3694,7 +3512,7 @@
           </w:p>
           <w:p>
             <w:pPr>
-              <w:pStyle w:val="BodyText"/>
+              <w:pStyle w:val="Corpotesto"/>
               <w:rPr>
                 <w:sz w:val="20"/>
                 <w:szCs w:val="20"/>
@@ -3712,7 +3530,7 @@
           </w:p>
           <w:p>
             <w:pPr>
-              <w:pStyle w:val="BodyText"/>
+              <w:pStyle w:val="Corpotesto"/>
               <w:rPr>
                 <w:color w:val="00B050"/>
                 <w:sz w:val="20"/>
@@ -3756,7 +3574,7 @@
           </w:p>
           <w:p>
             <w:pPr>
-              <w:pStyle w:val="BodyText"/>
+              <w:pStyle w:val="Corpotesto"/>
               <w:rPr>
                 <w:sz w:val="20"/>
                 <w:szCs w:val="20"/>
@@ -3766,7 +3584,7 @@
           </w:p>
           <w:p>
             <w:pPr>
-              <w:pStyle w:val="BodyText"/>
+              <w:pStyle w:val="Corpotesto"/>
               <w:rPr>
                 <w:sz w:val="20"/>
                 <w:szCs w:val="20"/>
@@ -3816,7 +3634,7 @@
           </w:p>
           <w:p>
             <w:pPr>
-              <w:pStyle w:val="BodyText"/>
+              <w:pStyle w:val="Corpotesto"/>
               <w:rPr>
                 <w:sz w:val="20"/>
                 <w:szCs w:val="20"/>
@@ -3826,7 +3644,7 @@
           </w:p>
           <w:p>
             <w:pPr>
-              <w:pStyle w:val="BodyText"/>
+              <w:pStyle w:val="Corpotesto"/>
               <w:numPr>
                 <w:ilvl w:val="0"/>
                 <w:numId w:val="13"/>
@@ -3880,7 +3698,7 @@
           </w:p>
           <w:p>
             <w:pPr>
-              <w:pStyle w:val="BodyText"/>
+              <w:pStyle w:val="Corpotesto"/>
               <w:numPr>
                 <w:ilvl w:val="0"/>
                 <w:numId w:val="13"/>
@@ -3902,7 +3720,7 @@
           </w:p>
           <w:p>
             <w:pPr>
-              <w:pStyle w:val="BodyText"/>
+              <w:pStyle w:val="Corpotesto"/>
               <w:numPr>
                 <w:ilvl w:val="0"/>
                 <w:numId w:val="13"/>
@@ -3924,7 +3742,7 @@
           </w:p>
           <w:p>
             <w:pPr>
-              <w:pStyle w:val="BodyText"/>
+              <w:pStyle w:val="Corpotesto"/>
               <w:numPr>
                 <w:ilvl w:val="0"/>
                 <w:numId w:val="13"/>
@@ -3946,7 +3764,7 @@
           </w:p>
           <w:p>
             <w:pPr>
-              <w:pStyle w:val="BodyText"/>
+              <w:pStyle w:val="Corpotesto"/>
               <w:rPr>
                 <w:sz w:val="20"/>
                 <w:szCs w:val="20"/>
@@ -3956,7 +3774,7 @@
           </w:p>
           <w:p>
             <w:pPr>
-              <w:pStyle w:val="BodyText"/>
+              <w:pStyle w:val="Corpotesto"/>
               <w:rPr>
                 <w:sz w:val="20"/>
                 <w:szCs w:val="20"/>
@@ -3966,7 +3784,7 @@
           </w:p>
           <w:p>
             <w:pPr>
-              <w:pStyle w:val="BodyText"/>
+              <w:pStyle w:val="Corpotesto"/>
               <w:rPr>
                 <w:color w:val="00B050"/>
                 <w:sz w:val="20"/>
@@ -3988,7 +3806,7 @@
           </w:p>
           <w:p>
             <w:pPr>
-              <w:pStyle w:val="BodyText"/>
+              <w:pStyle w:val="Corpotesto"/>
               <w:rPr>
                 <w:sz w:val="20"/>
                 <w:szCs w:val="20"/>
@@ -3998,7 +3816,7 @@
           </w:p>
           <w:p>
             <w:pPr>
-              <w:pStyle w:val="BodyText"/>
+              <w:pStyle w:val="Corpotesto"/>
               <w:numPr>
                 <w:ilvl w:val="0"/>
                 <w:numId w:val="14"/>
@@ -4020,7 +3838,7 @@
           </w:p>
           <w:p>
             <w:pPr>
-              <w:pStyle w:val="BodyText"/>
+              <w:pStyle w:val="Corpotesto"/>
               <w:numPr>
                 <w:ilvl w:val="0"/>
                 <w:numId w:val="14"/>
@@ -4042,7 +3860,7 @@
           </w:p>
           <w:p>
             <w:pPr>
-              <w:pStyle w:val="BodyText"/>
+              <w:pStyle w:val="Corpotesto"/>
               <w:numPr>
                 <w:ilvl w:val="0"/>
                 <w:numId w:val="14"/>
@@ -4064,7 +3882,7 @@
           </w:p>
           <w:p>
             <w:pPr>
-              <w:pStyle w:val="BodyText"/>
+              <w:pStyle w:val="Corpotesto"/>
               <w:numPr>
                 <w:ilvl w:val="0"/>
                 <w:numId w:val="14"/>
@@ -4086,7 +3904,7 @@
           </w:p>
           <w:p>
             <w:pPr>
-              <w:pStyle w:val="BodyText"/>
+              <w:pStyle w:val="Corpotesto"/>
               <w:numPr>
                 <w:ilvl w:val="0"/>
                 <w:numId w:val="14"/>
@@ -4108,7 +3926,7 @@
           </w:p>
           <w:p>
             <w:pPr>
-              <w:pStyle w:val="BodyText"/>
+              <w:pStyle w:val="Corpotesto"/>
               <w:rPr>
                 <w:color w:val="00B050"/>
                 <w:sz w:val="20"/>
@@ -4138,7 +3956,7 @@
           </w:p>
           <w:p>
             <w:pPr>
-              <w:pStyle w:val="BodyText"/>
+              <w:pStyle w:val="Corpotesto"/>
               <w:rPr>
                 <w:sz w:val="20"/>
                 <w:szCs w:val="20"/>
@@ -4148,7 +3966,7 @@
           </w:p>
           <w:p>
             <w:pPr>
-              <w:pStyle w:val="BodyText"/>
+              <w:pStyle w:val="Corpotesto"/>
               <w:rPr>
                 <w:sz w:val="20"/>
                 <w:szCs w:val="20"/>
@@ -4166,7 +3984,7 @@
           </w:p>
           <w:p>
             <w:pPr>
-              <w:pStyle w:val="BodyText"/>
+              <w:pStyle w:val="Corpotesto"/>
               <w:rPr>
                 <w:b/>
                 <w:bCs/>
@@ -4179,7 +3997,7 @@
           </w:p>
           <w:p>
             <w:pPr>
-              <w:pStyle w:val="BodyText"/>
+              <w:pStyle w:val="Corpotesto"/>
               <w:rPr>
                 <w:color w:val="00B050"/>
                 <w:sz w:val="20"/>
@@ -4201,7 +4019,7 @@
           </w:p>
           <w:p>
             <w:pPr>
-              <w:pStyle w:val="BodyText"/>
+              <w:pStyle w:val="Corpotesto"/>
               <w:rPr>
                 <w:sz w:val="20"/>
                 <w:szCs w:val="20"/>
@@ -4211,7 +4029,7 @@
           </w:p>
           <w:p>
             <w:pPr>
-              <w:pStyle w:val="BodyText"/>
+              <w:pStyle w:val="Corpotesto"/>
               <w:rPr>
                 <w:sz w:val="20"/>
                 <w:szCs w:val="20"/>
@@ -4224,66 +4042,12 @@
                 <w:szCs w:val="20"/>
                 <w:lang w:val="en-GB"/>
               </w:rPr>
-              <w:t xml:space="preserve">Whether preparing for a competitive bid, conditional signing, or regulatory approval phase, our ready-made </w:t>
-            </w:r>
-            <w:proofErr w:type="spellStart"/>
-            <w:r>
-              <w:rPr>
-                <w:sz w:val="20"/>
-                <w:szCs w:val="20"/>
-                <w:lang w:val="en-GB"/>
-              </w:rPr>
-              <w:t>HoldCo</w:t>
-            </w:r>
-            <w:proofErr w:type="spellEnd"/>
-            <w:r>
-              <w:rPr>
-                <w:sz w:val="20"/>
-                <w:szCs w:val="20"/>
-                <w:lang w:val="en-GB"/>
-              </w:rPr>
-              <w:t>–</w:t>
-            </w:r>
-            <w:proofErr w:type="spellStart"/>
-            <w:r>
-              <w:rPr>
-                <w:sz w:val="20"/>
-                <w:szCs w:val="20"/>
-                <w:lang w:val="en-GB"/>
-              </w:rPr>
-              <w:t>MidCo</w:t>
-            </w:r>
-            <w:proofErr w:type="spellEnd"/>
-            <w:r>
-              <w:rPr>
-                <w:sz w:val="20"/>
-                <w:szCs w:val="20"/>
-                <w:lang w:val="en-GB"/>
-              </w:rPr>
-              <w:t>–</w:t>
-            </w:r>
-            <w:proofErr w:type="spellStart"/>
-            <w:r>
-              <w:rPr>
-                <w:sz w:val="20"/>
-                <w:szCs w:val="20"/>
-                <w:lang w:val="en-GB"/>
-              </w:rPr>
-              <w:t>BidCo</w:t>
-            </w:r>
-            <w:proofErr w:type="spellEnd"/>
-            <w:r>
-              <w:rPr>
-                <w:sz w:val="20"/>
-                <w:szCs w:val="20"/>
-                <w:lang w:val="en-GB"/>
-              </w:rPr>
-              <w:t xml:space="preserve"> stacks give you the structural certainty to move decisively.</w:t>
-            </w:r>
-          </w:p>
-          <w:p>
-            <w:pPr>
-              <w:pStyle w:val="BodyText"/>
+              <w:t>Whether preparing for a competitive bid, conditional signing, or regulatory approval phase, our ready-made HoldCo–MidCo–BidCo stacks give you the structural certainty to move decisively.</w:t>
+            </w:r>
+          </w:p>
+          <w:p>
+            <w:pPr>
+              <w:pStyle w:val="Corpotesto"/>
               <w:rPr>
                 <w:sz w:val="20"/>
                 <w:szCs w:val="20"/>
@@ -4471,25 +4235,7 @@
                 <w:sz w:val="20"/>
                 <w:szCs w:val="20"/>
               </w:rPr>
-              <w:t>/services/</w:t>
-            </w:r>
-            <w:proofErr w:type="spellStart"/>
-            <w:r>
-              <w:rPr>
-                <w:rFonts w:ascii="Arial" w:hAnsi="Arial" w:cs="Arial"/>
-                <w:sz w:val="20"/>
-                <w:szCs w:val="20"/>
-              </w:rPr>
-              <w:t>spv</w:t>
-            </w:r>
-            <w:proofErr w:type="spellEnd"/>
-            <w:r>
-              <w:rPr>
-                <w:rFonts w:ascii="Arial" w:hAnsi="Arial" w:cs="Arial"/>
-                <w:sz w:val="20"/>
-                <w:szCs w:val="20"/>
-              </w:rPr>
-              <w:t>-holding-companies</w:t>
+              <w:t>/services/spv-holding-companies</w:t>
             </w:r>
           </w:p>
         </w:tc>
@@ -4554,14 +4300,15 @@
             <w:r>
               <w:rPr>
                 <w:rFonts w:ascii="Arial" w:hAnsi="Arial" w:cs="Arial"/>
-                <w:sz w:val="20"/>
-                <w:szCs w:val="20"/>
-              </w:rPr>
-              <w:object w:dxaOrig="1516" w:dyaOrig="989" w14:anchorId="2A1711BB">
-                <v:shape id="_x0000_i1028" type="#_x0000_t75" style="width:75.35pt;height:49.4pt" o:ole="">
+                <w:noProof/>
+                <w:sz w:val="20"/>
+                <w:szCs w:val="20"/>
+              </w:rPr>
+              <w:object w:dxaOrig="1516" w:dyaOrig="989" w14:anchorId="2DA3B60B">
+                <v:shape id="_x0000_i1034" type="#_x0000_t75" alt="" style="width:75.15pt;height:49.05pt;mso-width-percent:0;mso-height-percent:0;mso-width-percent:0;mso-height-percent:0" o:ole="">
                   <v:imagedata r:id="rId22" o:title=""/>
                 </v:shape>
-                <o:OLEObject Type="Embed" ProgID="Word.Document.12" ShapeID="_x0000_i1028" DrawAspect="Icon" ObjectID="_1837339786" r:id="rId23">
+                <o:OLEObject Type="Embed" ProgID="Word.Document.12" ShapeID="_x0000_i1034" DrawAspect="Icon" ObjectID="_1837707162" r:id="rId23">
                   <o:FieldCodes>\s</o:FieldCodes>
                 </o:OLEObject>
               </w:object>
@@ -4680,14 +4427,15 @@
             <w:r>
               <w:rPr>
                 <w:rFonts w:ascii="Arial" w:hAnsi="Arial" w:cs="Arial"/>
-                <w:sz w:val="20"/>
-                <w:szCs w:val="20"/>
-              </w:rPr>
-              <w:object w:dxaOrig="1516" w:dyaOrig="989" w14:anchorId="326FC8EB">
-                <v:shape id="_x0000_i1029" type="#_x0000_t75" style="width:75.35pt;height:49.4pt" o:ole="">
+                <w:noProof/>
+                <w:sz w:val="20"/>
+                <w:szCs w:val="20"/>
+              </w:rPr>
+              <w:object w:dxaOrig="1516" w:dyaOrig="989" w14:anchorId="793E175C">
+                <v:shape id="_x0000_i1033" type="#_x0000_t75" alt="" style="width:75.15pt;height:49.05pt;mso-width-percent:0;mso-height-percent:0;mso-width-percent:0;mso-height-percent:0" o:ole="">
                   <v:imagedata r:id="rId24" o:title=""/>
                 </v:shape>
-                <o:OLEObject Type="Embed" ProgID="Word.Document.12" ShapeID="_x0000_i1029" DrawAspect="Icon" ObjectID="_1837339787" r:id="rId25">
+                <o:OLEObject Type="Embed" ProgID="Word.Document.12" ShapeID="_x0000_i1033" DrawAspect="Icon" ObjectID="_1837707163" r:id="rId25">
                   <o:FieldCodes>\s</o:FieldCodes>
                 </o:OLEObject>
               </w:object>
@@ -5790,14 +5538,15 @@
             <w:r>
               <w:rPr>
                 <w:rFonts w:ascii="Arial" w:hAnsi="Arial" w:cs="Arial"/>
-                <w:sz w:val="20"/>
-                <w:szCs w:val="20"/>
-              </w:rPr>
-              <w:object w:dxaOrig="1516" w:dyaOrig="989" w14:anchorId="61A8653F">
-                <v:shape id="_x0000_i1056" type="#_x0000_t75" style="width:76.2pt;height:49.4pt" o:ole="">
+                <w:noProof/>
+                <w:sz w:val="20"/>
+                <w:szCs w:val="20"/>
+              </w:rPr>
+              <w:object w:dxaOrig="1516" w:dyaOrig="989" w14:anchorId="3EB385DD">
+                <v:shape id="_x0000_i1032" type="#_x0000_t75" alt="" style="width:75.95pt;height:49.05pt;mso-width-percent:0;mso-height-percent:0;mso-width-percent:0;mso-height-percent:0" o:ole="">
                   <v:imagedata r:id="rId26" o:title=""/>
                 </v:shape>
-                <o:OLEObject Type="Embed" ProgID="Word.Document.12" ShapeID="_x0000_i1056" DrawAspect="Icon" ObjectID="_1837339788" r:id="rId27">
+                <o:OLEObject Type="Embed" ProgID="Word.Document.12" ShapeID="_x0000_i1032" DrawAspect="Icon" ObjectID="_1837707164" r:id="rId27">
                   <o:FieldCodes>\s</o:FieldCodes>
                 </o:OLEObject>
               </w:object>
@@ -5933,14 +5682,15 @@
             <w:r>
               <w:rPr>
                 <w:rFonts w:ascii="Arial" w:hAnsi="Arial" w:cs="Arial"/>
-                <w:sz w:val="20"/>
-                <w:szCs w:val="20"/>
-              </w:rPr>
-              <w:object w:dxaOrig="1516" w:dyaOrig="989" w14:anchorId="318E2316">
-                <v:shape id="_x0000_i1030" type="#_x0000_t75" style="width:75.35pt;height:49.4pt" o:ole="">
+                <w:noProof/>
+                <w:sz w:val="20"/>
+                <w:szCs w:val="20"/>
+              </w:rPr>
+              <w:object w:dxaOrig="1516" w:dyaOrig="989" w14:anchorId="7253E9C8">
+                <v:shape id="_x0000_i1031" type="#_x0000_t75" alt="" style="width:75.15pt;height:49.05pt;mso-width-percent:0;mso-height-percent:0;mso-width-percent:0;mso-height-percent:0" o:ole="">
                   <v:imagedata r:id="rId28" o:title=""/>
                 </v:shape>
-                <o:OLEObject Type="Embed" ProgID="Word.Document.12" ShapeID="_x0000_i1030" DrawAspect="Icon" ObjectID="_1837339789" r:id="rId29">
+                <o:OLEObject Type="Embed" ProgID="Word.Document.12" ShapeID="_x0000_i1031" DrawAspect="Icon" ObjectID="_1837707165" r:id="rId29">
                   <o:FieldCodes>\s</o:FieldCodes>
                 </o:OLEObject>
               </w:object>
@@ -6112,23 +5862,13 @@
                 <w:szCs w:val="20"/>
               </w:rPr>
             </w:pPr>
-            <w:proofErr w:type="spellStart"/>
-            <w:r>
-              <w:rPr>
-                <w:rFonts w:ascii="Arial" w:hAnsi="Arial" w:cs="Arial"/>
-                <w:sz w:val="20"/>
-                <w:szCs w:val="20"/>
-              </w:rPr>
-              <w:t>Axsuma</w:t>
-            </w:r>
-            <w:proofErr w:type="spellEnd"/>
-            <w:r>
-              <w:rPr>
-                <w:rFonts w:ascii="Arial" w:hAnsi="Arial" w:cs="Arial"/>
-                <w:sz w:val="20"/>
-                <w:szCs w:val="20"/>
-              </w:rPr>
-              <w:t xml:space="preserve"> is a Companies House Authorised Corporate Service Provider (ACSP), authorised to carry out identity verification on behalf of clients.</w:t>
+            <w:r>
+              <w:rPr>
+                <w:rFonts w:ascii="Arial" w:hAnsi="Arial" w:cs="Arial"/>
+                <w:sz w:val="20"/>
+                <w:szCs w:val="20"/>
+              </w:rPr>
+              <w:t>Axsuma is a Companies House Authorised Corporate Service Provider (ACSP), authorised to carry out identity verification on behalf of clients.</w:t>
             </w:r>
           </w:p>
           <w:p>
@@ -6296,7 +6036,7 @@
           </w:p>
           <w:p>
             <w:pPr>
-              <w:pStyle w:val="ListParagraph"/>
+              <w:pStyle w:val="Paragrafoelenco"/>
               <w:numPr>
                 <w:ilvl w:val="0"/>
                 <w:numId w:val="12"/>
@@ -6367,7 +6107,7 @@
           </w:p>
           <w:p>
             <w:pPr>
-              <w:pStyle w:val="ListParagraph"/>
+              <w:pStyle w:val="Paragrafoelenco"/>
               <w:numPr>
                 <w:ilvl w:val="0"/>
                 <w:numId w:val="11"/>
@@ -6397,7 +6137,7 @@
           </w:p>
           <w:p>
             <w:pPr>
-              <w:pStyle w:val="ListParagraph"/>
+              <w:pStyle w:val="Paragrafoelenco"/>
               <w:numPr>
                 <w:ilvl w:val="0"/>
                 <w:numId w:val="11"/>
@@ -6492,18 +6232,8 @@
                 <w:sz w:val="20"/>
                 <w:szCs w:val="20"/>
               </w:rPr>
-              <w:t>/services/compliance-governance/</w:t>
-            </w:r>
-            <w:proofErr w:type="spellStart"/>
-            <w:r>
-              <w:rPr>
-                <w:rFonts w:ascii="Arial" w:hAnsi="Arial" w:cs="Arial"/>
-                <w:sz w:val="20"/>
-                <w:szCs w:val="20"/>
-              </w:rPr>
-              <w:t>uk-afs</w:t>
-            </w:r>
-            <w:proofErr w:type="spellEnd"/>
+              <w:t>/services/compliance-governance/uk-afs</w:t>
+            </w:r>
           </w:p>
         </w:tc>
         <w:tc>
@@ -6654,7 +6384,7 @@
           </w:p>
           <w:p>
             <w:pPr>
-              <w:pStyle w:val="ListParagraph"/>
+              <w:pStyle w:val="Paragrafoelenco"/>
               <w:numPr>
                 <w:ilvl w:val="0"/>
                 <w:numId w:val="6"/>
@@ -6676,7 +6406,7 @@
           </w:p>
           <w:p>
             <w:pPr>
-              <w:pStyle w:val="ListParagraph"/>
+              <w:pStyle w:val="Paragrafoelenco"/>
               <w:numPr>
                 <w:ilvl w:val="0"/>
                 <w:numId w:val="6"/>
@@ -6698,7 +6428,7 @@
           </w:p>
           <w:p>
             <w:pPr>
-              <w:pStyle w:val="ListParagraph"/>
+              <w:pStyle w:val="Paragrafoelenco"/>
               <w:numPr>
                 <w:ilvl w:val="0"/>
                 <w:numId w:val="6"/>
@@ -6720,7 +6450,7 @@
           </w:p>
           <w:p>
             <w:pPr>
-              <w:pStyle w:val="ListParagraph"/>
+              <w:pStyle w:val="Paragrafoelenco"/>
               <w:numPr>
                 <w:ilvl w:val="0"/>
                 <w:numId w:val="6"/>
@@ -7049,25 +6779,7 @@
                 <w:sz w:val="20"/>
                 <w:szCs w:val="20"/>
               </w:rPr>
-              <w:t xml:space="preserve">We know that many businesses are not entering a single market but expanding across multiple jurisdictions at the same time and require a coordinated </w:t>
-            </w:r>
-            <w:proofErr w:type="spellStart"/>
-            <w:r>
-              <w:rPr>
-                <w:rFonts w:ascii="Arial" w:hAnsi="Arial" w:cs="Arial"/>
-                <w:sz w:val="20"/>
-                <w:szCs w:val="20"/>
-              </w:rPr>
-              <w:t>multi jurisdictional</w:t>
-            </w:r>
-            <w:proofErr w:type="spellEnd"/>
-            <w:r>
-              <w:rPr>
-                <w:rFonts w:ascii="Arial" w:hAnsi="Arial" w:cs="Arial"/>
-                <w:sz w:val="20"/>
-                <w:szCs w:val="20"/>
-              </w:rPr>
-              <w:t xml:space="preserve"> approach to expansion.</w:t>
+              <w:t>We know that many businesses are not entering a single market but expanding across multiple jurisdictions at the same time and require a coordinated multi jurisdictional approach to expansion.</w:t>
             </w:r>
           </w:p>
           <w:p>
@@ -7232,7 +6944,7 @@
           </w:p>
           <w:p>
             <w:pPr>
-              <w:pStyle w:val="ListParagraph"/>
+              <w:pStyle w:val="Paragrafoelenco"/>
               <w:numPr>
                 <w:ilvl w:val="0"/>
                 <w:numId w:val="7"/>
@@ -7270,7 +6982,7 @@
           </w:p>
           <w:p>
             <w:pPr>
-              <w:pStyle w:val="ListParagraph"/>
+              <w:pStyle w:val="Paragrafoelenco"/>
               <w:numPr>
                 <w:ilvl w:val="0"/>
                 <w:numId w:val="7"/>
@@ -7292,7 +7004,7 @@
           </w:p>
           <w:p>
             <w:pPr>
-              <w:pStyle w:val="ListParagraph"/>
+              <w:pStyle w:val="Paragrafoelenco"/>
               <w:numPr>
                 <w:ilvl w:val="0"/>
                 <w:numId w:val="7"/>
@@ -7309,20 +7021,12 @@
                 <w:sz w:val="20"/>
                 <w:szCs w:val="20"/>
               </w:rPr>
-              <w:t>Accounting &amp; Tax</w:t>
-            </w:r>
-            <w:r>
-              <w:rPr>
-                <w:rFonts w:ascii="Arial" w:hAnsi="Arial" w:cs="Arial"/>
-                <w:sz w:val="20"/>
-                <w:szCs w:val="20"/>
-              </w:rPr>
-              <w:t xml:space="preserve"> </w:t>
-            </w:r>
-          </w:p>
-          <w:p>
-            <w:pPr>
-              <w:pStyle w:val="ListParagraph"/>
+              <w:t xml:space="preserve">Accounting &amp; Tax </w:t>
+            </w:r>
+          </w:p>
+          <w:p>
+            <w:pPr>
+              <w:pStyle w:val="Paragrafoelenco"/>
               <w:numPr>
                 <w:ilvl w:val="0"/>
                 <w:numId w:val="7"/>
@@ -7344,7 +7048,7 @@
           </w:p>
           <w:p>
             <w:pPr>
-              <w:pStyle w:val="ListParagraph"/>
+              <w:pStyle w:val="Paragrafoelenco"/>
               <w:numPr>
                 <w:ilvl w:val="0"/>
                 <w:numId w:val="7"/>
@@ -7366,7 +7070,7 @@
           </w:p>
           <w:p>
             <w:pPr>
-              <w:pStyle w:val="ListParagraph"/>
+              <w:pStyle w:val="Paragrafoelenco"/>
               <w:numPr>
                 <w:ilvl w:val="0"/>
                 <w:numId w:val="7"/>
@@ -7990,14 +7694,15 @@
             <w:r>
               <w:rPr>
                 <w:rFonts w:ascii="Arial" w:hAnsi="Arial" w:cs="Arial"/>
-                <w:sz w:val="20"/>
-                <w:szCs w:val="20"/>
-              </w:rPr>
-              <w:object w:dxaOrig="1516" w:dyaOrig="989" w14:anchorId="6179D90C">
-                <v:shape id="_x0000_i1038" type="#_x0000_t75" style="width:76.2pt;height:49.4pt" o:ole="">
+                <w:noProof/>
+                <w:sz w:val="20"/>
+                <w:szCs w:val="20"/>
+              </w:rPr>
+              <w:object w:dxaOrig="1516" w:dyaOrig="989" w14:anchorId="75D845E5">
+                <v:shape id="_x0000_i1030" type="#_x0000_t75" alt="" style="width:75.95pt;height:49.05pt;mso-width-percent:0;mso-height-percent:0;mso-width-percent:0;mso-height-percent:0" o:ole="">
                   <v:imagedata r:id="rId30" o:title=""/>
                 </v:shape>
-                <o:OLEObject Type="Embed" ProgID="Word.Document.12" ShapeID="_x0000_i1038" DrawAspect="Icon" ObjectID="_1837339790" r:id="rId31">
+                <o:OLEObject Type="Embed" ProgID="Word.Document.12" ShapeID="_x0000_i1030" DrawAspect="Icon" ObjectID="_1837707166" r:id="rId31">
                   <o:FieldCodes>\s</o:FieldCodes>
                 </o:OLEObject>
               </w:object>
@@ -8104,27 +7809,15 @@
                 <w:szCs w:val="20"/>
               </w:rPr>
             </w:pPr>
-            <w:proofErr w:type="spellStart"/>
-            <w:r>
-              <w:rPr>
-                <w:rFonts w:ascii="Arial" w:hAnsi="Arial" w:cs="Arial"/>
-                <w:b/>
-                <w:bCs/>
-                <w:sz w:val="20"/>
-                <w:szCs w:val="20"/>
-              </w:rPr>
-              <w:t>Axsuma</w:t>
-            </w:r>
-            <w:proofErr w:type="spellEnd"/>
-            <w:r>
-              <w:rPr>
-                <w:rFonts w:ascii="Arial" w:hAnsi="Arial" w:cs="Arial"/>
-                <w:b/>
-                <w:bCs/>
-                <w:sz w:val="20"/>
-                <w:szCs w:val="20"/>
-              </w:rPr>
-              <w:t xml:space="preserve"> Cookie Policy</w:t>
+            <w:r>
+              <w:rPr>
+                <w:rFonts w:ascii="Arial" w:hAnsi="Arial" w:cs="Arial"/>
+                <w:b/>
+                <w:bCs/>
+                <w:sz w:val="20"/>
+                <w:szCs w:val="20"/>
+              </w:rPr>
+              <w:t>Axsuma Cookie Policy</w:t>
             </w:r>
           </w:p>
           <w:p>
@@ -8642,14 +8335,15 @@
             <w:r>
               <w:rPr>
                 <w:rFonts w:ascii="Arial" w:hAnsi="Arial" w:cs="Arial"/>
-                <w:sz w:val="20"/>
-                <w:szCs w:val="20"/>
-              </w:rPr>
-              <w:object w:dxaOrig="1516" w:dyaOrig="989" w14:anchorId="0A8B73F1">
-                <v:shape id="_x0000_i1039" type="#_x0000_t75" style="width:76.2pt;height:49.4pt" o:ole="">
+                <w:noProof/>
+                <w:sz w:val="20"/>
+                <w:szCs w:val="20"/>
+              </w:rPr>
+              <w:object w:dxaOrig="1516" w:dyaOrig="989" w14:anchorId="63A16118">
+                <v:shape id="_x0000_i1029" type="#_x0000_t75" alt="" style="width:75.95pt;height:49.05pt;mso-width-percent:0;mso-height-percent:0;mso-width-percent:0;mso-height-percent:0" o:ole="">
                   <v:imagedata r:id="rId32" o:title=""/>
                 </v:shape>
-                <o:OLEObject Type="Embed" ProgID="Word.Document.12" ShapeID="_x0000_i1039" DrawAspect="Icon" ObjectID="_1837339791" r:id="rId33">
+                <o:OLEObject Type="Embed" ProgID="Word.Document.12" ShapeID="_x0000_i1029" DrawAspect="Icon" ObjectID="_1837707167" r:id="rId33">
                   <o:FieldCodes>\s</o:FieldCodes>
                 </o:OLEObject>
               </w:object>
@@ -8777,14 +8471,15 @@
             <w:r>
               <w:rPr>
                 <w:rFonts w:ascii="Arial" w:hAnsi="Arial" w:cs="Arial"/>
-                <w:sz w:val="20"/>
-                <w:szCs w:val="20"/>
-              </w:rPr>
-              <w:object w:dxaOrig="1516" w:dyaOrig="989" w14:anchorId="55A096C8">
-                <v:shape id="_x0000_i1040" type="#_x0000_t75" style="width:76.2pt;height:49.4pt" o:ole="">
+                <w:noProof/>
+                <w:sz w:val="20"/>
+                <w:szCs w:val="20"/>
+              </w:rPr>
+              <w:object w:dxaOrig="1516" w:dyaOrig="989" w14:anchorId="3A9606D0">
+                <v:shape id="_x0000_i1028" type="#_x0000_t75" alt="" style="width:75.95pt;height:49.05pt;mso-width-percent:0;mso-height-percent:0;mso-width-percent:0;mso-height-percent:0" o:ole="">
                   <v:imagedata r:id="rId34" o:title=""/>
                 </v:shape>
-                <o:OLEObject Type="Embed" ProgID="Word.Document.12" ShapeID="_x0000_i1040" DrawAspect="Icon" ObjectID="_1837339792" r:id="rId35">
+                <o:OLEObject Type="Embed" ProgID="Word.Document.12" ShapeID="_x0000_i1028" DrawAspect="Icon" ObjectID="_1837707168" r:id="rId35">
                   <o:FieldCodes>\s</o:FieldCodes>
                 </o:OLEObject>
               </w:object>
@@ -8912,14 +8607,15 @@
             <w:r>
               <w:rPr>
                 <w:rFonts w:ascii="Arial" w:hAnsi="Arial" w:cs="Arial"/>
-                <w:sz w:val="20"/>
-                <w:szCs w:val="20"/>
-              </w:rPr>
-              <w:object w:dxaOrig="1516" w:dyaOrig="989" w14:anchorId="054568C2">
-                <v:shape id="_x0000_i1041" type="#_x0000_t75" style="width:76.2pt;height:49.4pt" o:ole="">
+                <w:noProof/>
+                <w:sz w:val="20"/>
+                <w:szCs w:val="20"/>
+              </w:rPr>
+              <w:object w:dxaOrig="1516" w:dyaOrig="989" w14:anchorId="202E2AB2">
+                <v:shape id="_x0000_i1027" type="#_x0000_t75" alt="" style="width:75.95pt;height:49.05pt;mso-width-percent:0;mso-height-percent:0;mso-width-percent:0;mso-height-percent:0" o:ole="">
                   <v:imagedata r:id="rId36" o:title=""/>
                 </v:shape>
-                <o:OLEObject Type="Embed" ProgID="Word.Document.12" ShapeID="_x0000_i1041" DrawAspect="Icon" ObjectID="_1837339793" r:id="rId37">
+                <o:OLEObject Type="Embed" ProgID="Word.Document.12" ShapeID="_x0000_i1027" DrawAspect="Icon" ObjectID="_1837707169" r:id="rId37">
                   <o:FieldCodes>\s</o:FieldCodes>
                 </o:OLEObject>
               </w:object>
@@ -8982,25 +8678,7 @@
                 <w:sz w:val="20"/>
                 <w:szCs w:val="20"/>
               </w:rPr>
-              <w:t>/</w:t>
-            </w:r>
-            <w:proofErr w:type="spellStart"/>
-            <w:r>
-              <w:rPr>
-                <w:rFonts w:ascii="Arial" w:hAnsi="Arial" w:cs="Arial"/>
-                <w:sz w:val="20"/>
-                <w:szCs w:val="20"/>
-              </w:rPr>
-              <w:t>idv</w:t>
-            </w:r>
-            <w:proofErr w:type="spellEnd"/>
-            <w:r>
-              <w:rPr>
-                <w:rFonts w:ascii="Arial" w:hAnsi="Arial" w:cs="Arial"/>
-                <w:sz w:val="20"/>
-                <w:szCs w:val="20"/>
-              </w:rPr>
-              <w:t>-terms</w:t>
+              <w:t>/idv-terms</w:t>
             </w:r>
           </w:p>
         </w:tc>
@@ -9065,14 +8743,15 @@
             <w:r>
               <w:rPr>
                 <w:rFonts w:ascii="Arial" w:hAnsi="Arial" w:cs="Arial"/>
-                <w:sz w:val="20"/>
-                <w:szCs w:val="20"/>
-              </w:rPr>
-              <w:object w:dxaOrig="1516" w:dyaOrig="989" w14:anchorId="656B0382">
-                <v:shape id="_x0000_i1042" type="#_x0000_t75" style="width:76.2pt;height:49.4pt" o:ole="">
+                <w:noProof/>
+                <w:sz w:val="20"/>
+                <w:szCs w:val="20"/>
+              </w:rPr>
+              <w:object w:dxaOrig="1516" w:dyaOrig="989" w14:anchorId="63C9AF96">
+                <v:shape id="_x0000_i1026" type="#_x0000_t75" alt="" style="width:75.95pt;height:49.05pt;mso-width-percent:0;mso-height-percent:0;mso-width-percent:0;mso-height-percent:0" o:ole="">
                   <v:imagedata r:id="rId38" o:title=""/>
                 </v:shape>
-                <o:OLEObject Type="Embed" ProgID="Word.Document.12" ShapeID="_x0000_i1042" DrawAspect="Icon" ObjectID="_1837339794" r:id="rId39">
+                <o:OLEObject Type="Embed" ProgID="Word.Document.12" ShapeID="_x0000_i1026" DrawAspect="Icon" ObjectID="_1837707170" r:id="rId39">
                   <o:FieldCodes>\s</o:FieldCodes>
                 </o:OLEObject>
               </w:object>
@@ -9135,18 +8814,8 @@
                 <w:sz w:val="20"/>
                 <w:szCs w:val="20"/>
               </w:rPr>
-              <w:t>/</w:t>
-            </w:r>
-            <w:proofErr w:type="spellStart"/>
-            <w:r>
-              <w:rPr>
-                <w:rFonts w:ascii="Arial" w:hAnsi="Arial" w:cs="Arial"/>
-                <w:sz w:val="20"/>
-                <w:szCs w:val="20"/>
-              </w:rPr>
-              <w:t>gdpr</w:t>
-            </w:r>
-            <w:proofErr w:type="spellEnd"/>
+              <w:t>/gdpr</w:t>
+            </w:r>
           </w:p>
         </w:tc>
         <w:tc>
@@ -9210,14 +8879,15 @@
             <w:r>
               <w:rPr>
                 <w:rFonts w:ascii="Arial" w:hAnsi="Arial" w:cs="Arial"/>
-                <w:sz w:val="20"/>
-                <w:szCs w:val="20"/>
-              </w:rPr>
-              <w:object w:dxaOrig="1516" w:dyaOrig="989" w14:anchorId="4AA55101">
-                <v:shape id="_x0000_i1043" type="#_x0000_t75" style="width:76.2pt;height:49.4pt" o:ole="">
+                <w:noProof/>
+                <w:sz w:val="20"/>
+                <w:szCs w:val="20"/>
+              </w:rPr>
+              <w:object w:dxaOrig="1516" w:dyaOrig="989" w14:anchorId="14E5E71A">
+                <v:shape id="_x0000_i1025" type="#_x0000_t75" alt="" style="width:75.95pt;height:49.05pt;mso-width-percent:0;mso-height-percent:0;mso-width-percent:0;mso-height-percent:0" o:ole="">
                   <v:imagedata r:id="rId40" o:title=""/>
                 </v:shape>
-                <o:OLEObject Type="Embed" ProgID="Word.Document.12" ShapeID="_x0000_i1043" DrawAspect="Icon" ObjectID="_1837339795" r:id="rId41">
+                <o:OLEObject Type="Embed" ProgID="Word.Document.12" ShapeID="_x0000_i1025" DrawAspect="Icon" ObjectID="_1837707171" r:id="rId41">
                   <o:FieldCodes>\s</o:FieldCodes>
                 </o:OLEObject>
               </w:object>
@@ -12189,15 +11859,15 @@
     <w:lsdException w:name="Unresolved Mention" w:semiHidden="1" w:unhideWhenUsed="1"/>
     <w:lsdException w:name="Smart Link" w:semiHidden="1" w:unhideWhenUsed="1"/>
   </w:latentStyles>
-  <w:style w:type="paragraph" w:default="1" w:styleId="Normal">
+  <w:style w:type="paragraph" w:default="1" w:styleId="Normale">
     <w:name w:val="Normal"/>
     <w:qFormat/>
   </w:style>
-  <w:style w:type="paragraph" w:styleId="Heading1">
+  <w:style w:type="paragraph" w:styleId="Titolo1">
     <w:name w:val="heading 1"/>
-    <w:basedOn w:val="Normal"/>
-    <w:next w:val="Normal"/>
-    <w:link w:val="Heading1Char"/>
+    <w:basedOn w:val="Normale"/>
+    <w:next w:val="Normale"/>
+    <w:link w:val="Titolo1Carattere"/>
     <w:uiPriority w:val="9"/>
     <w:qFormat/>
     <w:rsid w:val="00904933"/>
@@ -12214,11 +11884,11 @@
       <w:szCs w:val="40"/>
     </w:rPr>
   </w:style>
-  <w:style w:type="paragraph" w:styleId="Heading2">
+  <w:style w:type="paragraph" w:styleId="Titolo2">
     <w:name w:val="heading 2"/>
-    <w:basedOn w:val="Normal"/>
-    <w:next w:val="Normal"/>
-    <w:link w:val="Heading2Char"/>
+    <w:basedOn w:val="Normale"/>
+    <w:next w:val="Normale"/>
+    <w:link w:val="Titolo2Carattere"/>
     <w:uiPriority w:val="9"/>
     <w:semiHidden/>
     <w:unhideWhenUsed/>
@@ -12237,11 +11907,11 @@
       <w:szCs w:val="32"/>
     </w:rPr>
   </w:style>
-  <w:style w:type="paragraph" w:styleId="Heading3">
+  <w:style w:type="paragraph" w:styleId="Titolo3">
     <w:name w:val="heading 3"/>
-    <w:basedOn w:val="Normal"/>
-    <w:next w:val="Normal"/>
-    <w:link w:val="Heading3Char"/>
+    <w:basedOn w:val="Normale"/>
+    <w:next w:val="Normale"/>
+    <w:link w:val="Titolo3Carattere"/>
     <w:uiPriority w:val="9"/>
     <w:semiHidden/>
     <w:unhideWhenUsed/>
@@ -12260,11 +11930,11 @@
       <w:szCs w:val="28"/>
     </w:rPr>
   </w:style>
-  <w:style w:type="paragraph" w:styleId="Heading4">
+  <w:style w:type="paragraph" w:styleId="Titolo4">
     <w:name w:val="heading 4"/>
-    <w:basedOn w:val="Normal"/>
-    <w:next w:val="Normal"/>
-    <w:link w:val="Heading4Char"/>
+    <w:basedOn w:val="Normale"/>
+    <w:next w:val="Normale"/>
+    <w:link w:val="Titolo4Carattere"/>
     <w:uiPriority w:val="9"/>
     <w:semiHidden/>
     <w:unhideWhenUsed/>
@@ -12283,11 +11953,11 @@
       <w:color w:val="0F4761" w:themeColor="accent1" w:themeShade="BF"/>
     </w:rPr>
   </w:style>
-  <w:style w:type="paragraph" w:styleId="Heading5">
+  <w:style w:type="paragraph" w:styleId="Titolo5">
     <w:name w:val="heading 5"/>
-    <w:basedOn w:val="Normal"/>
-    <w:next w:val="Normal"/>
-    <w:link w:val="Heading5Char"/>
+    <w:basedOn w:val="Normale"/>
+    <w:next w:val="Normale"/>
+    <w:link w:val="Titolo5Carattere"/>
     <w:uiPriority w:val="9"/>
     <w:semiHidden/>
     <w:unhideWhenUsed/>
@@ -12304,11 +11974,11 @@
       <w:color w:val="0F4761" w:themeColor="accent1" w:themeShade="BF"/>
     </w:rPr>
   </w:style>
-  <w:style w:type="paragraph" w:styleId="Heading6">
+  <w:style w:type="paragraph" w:styleId="Titolo6">
     <w:name w:val="heading 6"/>
-    <w:basedOn w:val="Normal"/>
-    <w:next w:val="Normal"/>
-    <w:link w:val="Heading6Char"/>
+    <w:basedOn w:val="Normale"/>
+    <w:next w:val="Normale"/>
+    <w:link w:val="Titolo6Carattere"/>
     <w:uiPriority w:val="9"/>
     <w:semiHidden/>
     <w:unhideWhenUsed/>
@@ -12327,11 +11997,11 @@
       <w:color w:val="595959" w:themeColor="text1" w:themeTint="A6"/>
     </w:rPr>
   </w:style>
-  <w:style w:type="paragraph" w:styleId="Heading7">
+  <w:style w:type="paragraph" w:styleId="Titolo7">
     <w:name w:val="heading 7"/>
-    <w:basedOn w:val="Normal"/>
-    <w:next w:val="Normal"/>
-    <w:link w:val="Heading7Char"/>
+    <w:basedOn w:val="Normale"/>
+    <w:next w:val="Normale"/>
+    <w:link w:val="Titolo7Carattere"/>
     <w:uiPriority w:val="9"/>
     <w:semiHidden/>
     <w:unhideWhenUsed/>
@@ -12348,11 +12018,11 @@
       <w:color w:val="595959" w:themeColor="text1" w:themeTint="A6"/>
     </w:rPr>
   </w:style>
-  <w:style w:type="paragraph" w:styleId="Heading8">
+  <w:style w:type="paragraph" w:styleId="Titolo8">
     <w:name w:val="heading 8"/>
-    <w:basedOn w:val="Normal"/>
-    <w:next w:val="Normal"/>
-    <w:link w:val="Heading8Char"/>
+    <w:basedOn w:val="Normale"/>
+    <w:next w:val="Normale"/>
+    <w:link w:val="Titolo8Carattere"/>
     <w:uiPriority w:val="9"/>
     <w:semiHidden/>
     <w:unhideWhenUsed/>
@@ -12371,11 +12041,11 @@
       <w:color w:val="272727" w:themeColor="text1" w:themeTint="D8"/>
     </w:rPr>
   </w:style>
-  <w:style w:type="paragraph" w:styleId="Heading9">
+  <w:style w:type="paragraph" w:styleId="Titolo9">
     <w:name w:val="heading 9"/>
-    <w:basedOn w:val="Normal"/>
-    <w:next w:val="Normal"/>
-    <w:link w:val="Heading9Char"/>
+    <w:basedOn w:val="Normale"/>
+    <w:next w:val="Normale"/>
+    <w:link w:val="Titolo9Carattere"/>
     <w:uiPriority w:val="9"/>
     <w:semiHidden/>
     <w:unhideWhenUsed/>
@@ -12392,12 +12062,13 @@
       <w:color w:val="272727" w:themeColor="text1" w:themeTint="D8"/>
     </w:rPr>
   </w:style>
-  <w:style w:type="character" w:default="1" w:styleId="DefaultParagraphFont">
+  <w:style w:type="character" w:default="1" w:styleId="Carpredefinitoparagrafo">
     <w:name w:val="Default Paragraph Font"/>
     <w:uiPriority w:val="1"/>
+    <w:semiHidden/>
     <w:unhideWhenUsed/>
   </w:style>
-  <w:style w:type="table" w:default="1" w:styleId="TableNormal">
+  <w:style w:type="table" w:default="1" w:styleId="Tabellanormale">
     <w:name w:val="Normal Table"/>
     <w:uiPriority w:val="99"/>
     <w:semiHidden/>
@@ -12412,16 +12083,16 @@
       </w:tblCellMar>
     </w:tblPr>
   </w:style>
-  <w:style w:type="numbering" w:default="1" w:styleId="NoList">
+  <w:style w:type="numbering" w:default="1" w:styleId="Nessunelenco">
     <w:name w:val="No List"/>
     <w:uiPriority w:val="99"/>
     <w:semiHidden/>
     <w:unhideWhenUsed/>
   </w:style>
-  <w:style w:type="character" w:customStyle="1" w:styleId="Heading1Char">
-    <w:name w:val="Heading 1 Char"/>
-    <w:basedOn w:val="DefaultParagraphFont"/>
-    <w:link w:val="Heading1"/>
+  <w:style w:type="character" w:customStyle="1" w:styleId="Titolo1Carattere">
+    <w:name w:val="Titolo 1 Carattere"/>
+    <w:basedOn w:val="Carpredefinitoparagrafo"/>
+    <w:link w:val="Titolo1"/>
     <w:uiPriority w:val="9"/>
     <w:rsid w:val="00904933"/>
     <w:rPr>
@@ -12431,10 +12102,10 @@
       <w:szCs w:val="40"/>
     </w:rPr>
   </w:style>
-  <w:style w:type="character" w:customStyle="1" w:styleId="Heading2Char">
-    <w:name w:val="Heading 2 Char"/>
-    <w:basedOn w:val="DefaultParagraphFont"/>
-    <w:link w:val="Heading2"/>
+  <w:style w:type="character" w:customStyle="1" w:styleId="Titolo2Carattere">
+    <w:name w:val="Titolo 2 Carattere"/>
+    <w:basedOn w:val="Carpredefinitoparagrafo"/>
+    <w:link w:val="Titolo2"/>
     <w:uiPriority w:val="9"/>
     <w:semiHidden/>
     <w:rsid w:val="00904933"/>
@@ -12445,10 +12116,10 @@
       <w:szCs w:val="32"/>
     </w:rPr>
   </w:style>
-  <w:style w:type="character" w:customStyle="1" w:styleId="Heading3Char">
-    <w:name w:val="Heading 3 Char"/>
-    <w:basedOn w:val="DefaultParagraphFont"/>
-    <w:link w:val="Heading3"/>
+  <w:style w:type="character" w:customStyle="1" w:styleId="Titolo3Carattere">
+    <w:name w:val="Titolo 3 Carattere"/>
+    <w:basedOn w:val="Carpredefinitoparagrafo"/>
+    <w:link w:val="Titolo3"/>
     <w:uiPriority w:val="9"/>
     <w:semiHidden/>
     <w:rsid w:val="00904933"/>
@@ -12459,10 +12130,10 @@
       <w:szCs w:val="28"/>
     </w:rPr>
   </w:style>
-  <w:style w:type="character" w:customStyle="1" w:styleId="Heading4Char">
-    <w:name w:val="Heading 4 Char"/>
-    <w:basedOn w:val="DefaultParagraphFont"/>
-    <w:link w:val="Heading4"/>
+  <w:style w:type="character" w:customStyle="1" w:styleId="Titolo4Carattere">
+    <w:name w:val="Titolo 4 Carattere"/>
+    <w:basedOn w:val="Carpredefinitoparagrafo"/>
+    <w:link w:val="Titolo4"/>
     <w:uiPriority w:val="9"/>
     <w:semiHidden/>
     <w:rsid w:val="00904933"/>
@@ -12473,10 +12144,10 @@
       <w:color w:val="0F4761" w:themeColor="accent1" w:themeShade="BF"/>
     </w:rPr>
   </w:style>
-  <w:style w:type="character" w:customStyle="1" w:styleId="Heading5Char">
-    <w:name w:val="Heading 5 Char"/>
-    <w:basedOn w:val="DefaultParagraphFont"/>
-    <w:link w:val="Heading5"/>
+  <w:style w:type="character" w:customStyle="1" w:styleId="Titolo5Carattere">
+    <w:name w:val="Titolo 5 Carattere"/>
+    <w:basedOn w:val="Carpredefinitoparagrafo"/>
+    <w:link w:val="Titolo5"/>
     <w:uiPriority w:val="9"/>
     <w:semiHidden/>
     <w:rsid w:val="00904933"/>
@@ -12485,10 +12156,10 @@
       <w:color w:val="0F4761" w:themeColor="accent1" w:themeShade="BF"/>
     </w:rPr>
   </w:style>
-  <w:style w:type="character" w:customStyle="1" w:styleId="Heading6Char">
-    <w:name w:val="Heading 6 Char"/>
-    <w:basedOn w:val="DefaultParagraphFont"/>
-    <w:link w:val="Heading6"/>
+  <w:style w:type="character" w:customStyle="1" w:styleId="Titolo6Carattere">
+    <w:name w:val="Titolo 6 Carattere"/>
+    <w:basedOn w:val="Carpredefinitoparagrafo"/>
+    <w:link w:val="Titolo6"/>
     <w:uiPriority w:val="9"/>
     <w:semiHidden/>
     <w:rsid w:val="00904933"/>
@@ -12499,10 +12170,10 @@
       <w:color w:val="595959" w:themeColor="text1" w:themeTint="A6"/>
     </w:rPr>
   </w:style>
-  <w:style w:type="character" w:customStyle="1" w:styleId="Heading7Char">
-    <w:name w:val="Heading 7 Char"/>
-    <w:basedOn w:val="DefaultParagraphFont"/>
-    <w:link w:val="Heading7"/>
+  <w:style w:type="character" w:customStyle="1" w:styleId="Titolo7Carattere">
+    <w:name w:val="Titolo 7 Carattere"/>
+    <w:basedOn w:val="Carpredefinitoparagrafo"/>
+    <w:link w:val="Titolo7"/>
     <w:uiPriority w:val="9"/>
     <w:semiHidden/>
     <w:rsid w:val="00904933"/>
@@ -12511,10 +12182,10 @@
       <w:color w:val="595959" w:themeColor="text1" w:themeTint="A6"/>
     </w:rPr>
   </w:style>
-  <w:style w:type="character" w:customStyle="1" w:styleId="Heading8Char">
-    <w:name w:val="Heading 8 Char"/>
-    <w:basedOn w:val="DefaultParagraphFont"/>
-    <w:link w:val="Heading8"/>
+  <w:style w:type="character" w:customStyle="1" w:styleId="Titolo8Carattere">
+    <w:name w:val="Titolo 8 Carattere"/>
+    <w:basedOn w:val="Carpredefinitoparagrafo"/>
+    <w:link w:val="Titolo8"/>
     <w:uiPriority w:val="9"/>
     <w:semiHidden/>
     <w:rsid w:val="00904933"/>
@@ -12525,10 +12196,10 @@
       <w:color w:val="272727" w:themeColor="text1" w:themeTint="D8"/>
     </w:rPr>
   </w:style>
-  <w:style w:type="character" w:customStyle="1" w:styleId="Heading9Char">
-    <w:name w:val="Heading 9 Char"/>
-    <w:basedOn w:val="DefaultParagraphFont"/>
-    <w:link w:val="Heading9"/>
+  <w:style w:type="character" w:customStyle="1" w:styleId="Titolo9Carattere">
+    <w:name w:val="Titolo 9 Carattere"/>
+    <w:basedOn w:val="Carpredefinitoparagrafo"/>
+    <w:link w:val="Titolo9"/>
     <w:uiPriority w:val="9"/>
     <w:semiHidden/>
     <w:rsid w:val="00904933"/>
@@ -12537,11 +12208,11 @@
       <w:color w:val="272727" w:themeColor="text1" w:themeTint="D8"/>
     </w:rPr>
   </w:style>
-  <w:style w:type="paragraph" w:styleId="Title">
+  <w:style w:type="paragraph" w:styleId="Titolo">
     <w:name w:val="Title"/>
-    <w:basedOn w:val="Normal"/>
-    <w:next w:val="Normal"/>
-    <w:link w:val="TitleChar"/>
+    <w:basedOn w:val="Normale"/>
+    <w:next w:val="Normale"/>
+    <w:link w:val="TitoloCarattere"/>
     <w:uiPriority w:val="10"/>
     <w:qFormat/>
     <w:rsid w:val="00904933"/>
@@ -12557,10 +12228,10 @@
       <w:szCs w:val="56"/>
     </w:rPr>
   </w:style>
-  <w:style w:type="character" w:customStyle="1" w:styleId="TitleChar">
-    <w:name w:val="Title Char"/>
-    <w:basedOn w:val="DefaultParagraphFont"/>
-    <w:link w:val="Title"/>
+  <w:style w:type="character" w:customStyle="1" w:styleId="TitoloCarattere">
+    <w:name w:val="Titolo Carattere"/>
+    <w:basedOn w:val="Carpredefinitoparagrafo"/>
+    <w:link w:val="Titolo"/>
     <w:uiPriority w:val="10"/>
     <w:rsid w:val="00904933"/>
     <w:rPr>
@@ -12571,11 +12242,11 @@
       <w:szCs w:val="56"/>
     </w:rPr>
   </w:style>
-  <w:style w:type="paragraph" w:styleId="Subtitle">
+  <w:style w:type="paragraph" w:styleId="Sottotitolo">
     <w:name w:val="Subtitle"/>
-    <w:basedOn w:val="Normal"/>
-    <w:next w:val="Normal"/>
-    <w:link w:val="SubtitleChar"/>
+    <w:basedOn w:val="Normale"/>
+    <w:next w:val="Normale"/>
+    <w:link w:val="SottotitoloCarattere"/>
     <w:uiPriority w:val="11"/>
     <w:qFormat/>
     <w:rsid w:val="00904933"/>
@@ -12592,10 +12263,10 @@
       <w:szCs w:val="28"/>
     </w:rPr>
   </w:style>
-  <w:style w:type="character" w:customStyle="1" w:styleId="SubtitleChar">
-    <w:name w:val="Subtitle Char"/>
-    <w:basedOn w:val="DefaultParagraphFont"/>
-    <w:link w:val="Subtitle"/>
+  <w:style w:type="character" w:customStyle="1" w:styleId="SottotitoloCarattere">
+    <w:name w:val="Sottotitolo Carattere"/>
+    <w:basedOn w:val="Carpredefinitoparagrafo"/>
+    <w:link w:val="Sottotitolo"/>
     <w:uiPriority w:val="11"/>
     <w:rsid w:val="00904933"/>
     <w:rPr>
@@ -12606,11 +12277,11 @@
       <w:szCs w:val="28"/>
     </w:rPr>
   </w:style>
-  <w:style w:type="paragraph" w:styleId="Quote">
+  <w:style w:type="paragraph" w:styleId="Citazione">
     <w:name w:val="Quote"/>
-    <w:basedOn w:val="Normal"/>
-    <w:next w:val="Normal"/>
-    <w:link w:val="QuoteChar"/>
+    <w:basedOn w:val="Normale"/>
+    <w:next w:val="Normale"/>
+    <w:link w:val="CitazioneCarattere"/>
     <w:uiPriority w:val="29"/>
     <w:qFormat/>
     <w:rsid w:val="00904933"/>
@@ -12624,10 +12295,10 @@
       <w:color w:val="404040" w:themeColor="text1" w:themeTint="BF"/>
     </w:rPr>
   </w:style>
-  <w:style w:type="character" w:customStyle="1" w:styleId="QuoteChar">
-    <w:name w:val="Quote Char"/>
-    <w:basedOn w:val="DefaultParagraphFont"/>
-    <w:link w:val="Quote"/>
+  <w:style w:type="character" w:customStyle="1" w:styleId="CitazioneCarattere">
+    <w:name w:val="Citazione Carattere"/>
+    <w:basedOn w:val="Carpredefinitoparagrafo"/>
+    <w:link w:val="Citazione"/>
     <w:uiPriority w:val="29"/>
     <w:rsid w:val="00904933"/>
     <w:rPr>
@@ -12636,9 +12307,9 @@
       <w:color w:val="404040" w:themeColor="text1" w:themeTint="BF"/>
     </w:rPr>
   </w:style>
-  <w:style w:type="paragraph" w:styleId="ListParagraph">
+  <w:style w:type="paragraph" w:styleId="Paragrafoelenco">
     <w:name w:val="List Paragraph"/>
-    <w:basedOn w:val="Normal"/>
+    <w:basedOn w:val="Normale"/>
     <w:uiPriority w:val="34"/>
     <w:qFormat/>
     <w:rsid w:val="00904933"/>
@@ -12647,9 +12318,9 @@
       <w:contextualSpacing/>
     </w:pPr>
   </w:style>
-  <w:style w:type="character" w:styleId="IntenseEmphasis">
+  <w:style w:type="character" w:styleId="Enfasiintensa">
     <w:name w:val="Intense Emphasis"/>
-    <w:basedOn w:val="DefaultParagraphFont"/>
+    <w:basedOn w:val="Carpredefinitoparagrafo"/>
     <w:uiPriority w:val="21"/>
     <w:qFormat/>
     <w:rsid w:val="00904933"/>
@@ -12659,11 +12330,11 @@
       <w:color w:val="0F4761" w:themeColor="accent1" w:themeShade="BF"/>
     </w:rPr>
   </w:style>
-  <w:style w:type="paragraph" w:styleId="IntenseQuote">
+  <w:style w:type="paragraph" w:styleId="Citazioneintensa">
     <w:name w:val="Intense Quote"/>
-    <w:basedOn w:val="Normal"/>
-    <w:next w:val="Normal"/>
-    <w:link w:val="IntenseQuoteChar"/>
+    <w:basedOn w:val="Normale"/>
+    <w:next w:val="Normale"/>
+    <w:link w:val="CitazioneintensaCarattere"/>
     <w:uiPriority w:val="30"/>
     <w:qFormat/>
     <w:rsid w:val="00904933"/>
@@ -12682,10 +12353,10 @@
       <w:color w:val="0F4761" w:themeColor="accent1" w:themeShade="BF"/>
     </w:rPr>
   </w:style>
-  <w:style w:type="character" w:customStyle="1" w:styleId="IntenseQuoteChar">
-    <w:name w:val="Intense Quote Char"/>
-    <w:basedOn w:val="DefaultParagraphFont"/>
-    <w:link w:val="IntenseQuote"/>
+  <w:style w:type="character" w:customStyle="1" w:styleId="CitazioneintensaCarattere">
+    <w:name w:val="Citazione intensa Carattere"/>
+    <w:basedOn w:val="Carpredefinitoparagrafo"/>
+    <w:link w:val="Citazioneintensa"/>
     <w:uiPriority w:val="30"/>
     <w:rsid w:val="00904933"/>
     <w:rPr>
@@ -12694,9 +12365,9 @@
       <w:color w:val="0F4761" w:themeColor="accent1" w:themeShade="BF"/>
     </w:rPr>
   </w:style>
-  <w:style w:type="character" w:styleId="IntenseReference">
+  <w:style w:type="character" w:styleId="Riferimentointenso">
     <w:name w:val="Intense Reference"/>
-    <w:basedOn w:val="DefaultParagraphFont"/>
+    <w:basedOn w:val="Carpredefinitoparagrafo"/>
     <w:uiPriority w:val="32"/>
     <w:qFormat/>
     <w:rsid w:val="00904933"/>
@@ -12708,9 +12379,9 @@
       <w:spacing w:val="5"/>
     </w:rPr>
   </w:style>
-  <w:style w:type="table" w:styleId="TableGrid">
+  <w:style w:type="table" w:styleId="Grigliatabella">
     <w:name w:val="Table Grid"/>
-    <w:basedOn w:val="TableNormal"/>
+    <w:basedOn w:val="Tabellanormale"/>
     <w:uiPriority w:val="39"/>
     <w:rsid w:val="007E6AF6"/>
     <w:pPr>
@@ -12727,9 +12398,9 @@
       </w:tblBorders>
     </w:tblPr>
   </w:style>
-  <w:style w:type="character" w:styleId="HTMLCode">
+  <w:style w:type="character" w:styleId="CodiceHTML">
     <w:name w:val="HTML Code"/>
-    <w:basedOn w:val="DefaultParagraphFont"/>
+    <w:basedOn w:val="Carpredefinitoparagrafo"/>
     <w:uiPriority w:val="99"/>
     <w:semiHidden/>
     <w:unhideWhenUsed/>
@@ -12740,10 +12411,10 @@
       <w:szCs w:val="20"/>
     </w:rPr>
   </w:style>
-  <w:style w:type="paragraph" w:styleId="BodyText">
+  <w:style w:type="paragraph" w:styleId="Corpotesto">
     <w:name w:val="Body Text"/>
-    <w:basedOn w:val="Normal"/>
-    <w:link w:val="BodyTextChar"/>
+    <w:basedOn w:val="Normale"/>
+    <w:link w:val="CorpotestoCarattere"/>
     <w:uiPriority w:val="1"/>
     <w:qFormat/>
     <w:rsid w:val="00AC5AE7"/>
@@ -12762,10 +12433,10 @@
       <w14:ligatures w14:val="none"/>
     </w:rPr>
   </w:style>
-  <w:style w:type="character" w:customStyle="1" w:styleId="BodyTextChar">
-    <w:name w:val="Body Text Char"/>
-    <w:basedOn w:val="DefaultParagraphFont"/>
-    <w:link w:val="BodyText"/>
+  <w:style w:type="character" w:customStyle="1" w:styleId="CorpotestoCarattere">
+    <w:name w:val="Corpo testo Carattere"/>
+    <w:basedOn w:val="Carpredefinitoparagrafo"/>
+    <w:link w:val="Corpotesto"/>
     <w:uiPriority w:val="1"/>
     <w:rsid w:val="00AC5AE7"/>
     <w:rPr>
@@ -13096,6 +12767,17 @@
 </file>
 
 <file path=customXml/item1.xml><?xml version="1.0" encoding="utf-8"?>
+<p:properties xmlns:p="http://schemas.microsoft.com/office/2006/metadata/properties" xmlns:xsi="http://www.w3.org/2001/XMLSchema-instance" xmlns:pc="http://schemas.microsoft.com/office/infopath/2007/PartnerControls">
+  <documentManagement>
+    <lcf76f155ced4ddcb4097134ff3c332f xmlns="35340a7f-ac58-4c30-95c7-c3b83052e586">
+      <Terms xmlns="http://schemas.microsoft.com/office/infopath/2007/PartnerControls"/>
+    </lcf76f155ced4ddcb4097134ff3c332f>
+    <TaxCatchAll xmlns="beafe44e-21f3-44c4-a034-81122030d759" xsi:nil="true"/>
+  </documentManagement>
+</p:properties>
+</file>
+
+<file path=customXml/item2.xml><?xml version="1.0" encoding="utf-8"?>
 <ct:contentTypeSchema xmlns:ct="http://schemas.microsoft.com/office/2006/metadata/contentType" xmlns:ma="http://schemas.microsoft.com/office/2006/metadata/properties/metaAttributes" ct:_="" ma:_="" ma:contentTypeName="Document" ma:contentTypeID="0x0101008EA76E541AFC26409F844BF74EB825EC" ma:contentTypeVersion="10" ma:contentTypeDescription="Create a new document." ma:contentTypeScope="" ma:versionID="354763272bb2658f1a6f97607d7555cd">
   <xsd:schema xmlns:xsd="http://www.w3.org/2001/XMLSchema" xmlns:xs="http://www.w3.org/2001/XMLSchema" xmlns:p="http://schemas.microsoft.com/office/2006/metadata/properties" xmlns:ns2="35340a7f-ac58-4c30-95c7-c3b83052e586" xmlns:ns3="beafe44e-21f3-44c4-a034-81122030d759" targetNamespace="http://schemas.microsoft.com/office/2006/metadata/properties" ma:root="true" ma:fieldsID="256679a6c6b2f3a312d497e7c441d29d" ns2:_="" ns3:_="">
     <xsd:import namespace="35340a7f-ac58-4c30-95c7-c3b83052e586"/>
@@ -13284,17 +12966,6 @@
 </ct:contentTypeSchema>
 </file>
 
-<file path=customXml/item2.xml><?xml version="1.0" encoding="utf-8"?>
-<p:properties xmlns:p="http://schemas.microsoft.com/office/2006/metadata/properties" xmlns:xsi="http://www.w3.org/2001/XMLSchema-instance" xmlns:pc="http://schemas.microsoft.com/office/infopath/2007/PartnerControls">
-  <documentManagement>
-    <lcf76f155ced4ddcb4097134ff3c332f xmlns="35340a7f-ac58-4c30-95c7-c3b83052e586">
-      <Terms xmlns="http://schemas.microsoft.com/office/infopath/2007/PartnerControls"/>
-    </lcf76f155ced4ddcb4097134ff3c332f>
-    <TaxCatchAll xmlns="beafe44e-21f3-44c4-a034-81122030d759" xsi:nil="true"/>
-  </documentManagement>
-</p:properties>
-</file>
-
 <file path=customXml/item3.xml><?xml version="1.0" encoding="utf-8"?>
 <?mso-contentType ?>
 <FormTemplates xmlns="http://schemas.microsoft.com/sharepoint/v3/contenttype/forms">
@@ -13305,6 +12976,17 @@
 </file>
 
 <file path=customXml/itemProps1.xml><?xml version="1.0" encoding="utf-8"?>
+<ds:datastoreItem xmlns:ds="http://schemas.openxmlformats.org/officeDocument/2006/customXml" ds:itemID="{72B1C475-C543-4281-AE1F-4A1ED149EAD0}">
+  <ds:schemaRefs>
+    <ds:schemaRef ds:uri="http://schemas.microsoft.com/office/2006/metadata/properties"/>
+    <ds:schemaRef ds:uri="http://schemas.microsoft.com/office/infopath/2007/PartnerControls"/>
+    <ds:schemaRef ds:uri="35340a7f-ac58-4c30-95c7-c3b83052e586"/>
+    <ds:schemaRef ds:uri="beafe44e-21f3-44c4-a034-81122030d759"/>
+  </ds:schemaRefs>
+</ds:datastoreItem>
+</file>
+
+<file path=customXml/itemProps2.xml><?xml version="1.0" encoding="utf-8"?>
 <ds:datastoreItem xmlns:ds="http://schemas.openxmlformats.org/officeDocument/2006/customXml" ds:itemID="{8D098001-1D3A-4FA4-AF9E-2DEC10C26E41}">
   <ds:schemaRefs>
     <ds:schemaRef ds:uri="http://schemas.microsoft.com/office/2006/metadata/contentType"/>
@@ -13323,17 +13005,6 @@
 </ds:datastoreItem>
 </file>
 
-<file path=customXml/itemProps2.xml><?xml version="1.0" encoding="utf-8"?>
-<ds:datastoreItem xmlns:ds="http://schemas.openxmlformats.org/officeDocument/2006/customXml" ds:itemID="{72B1C475-C543-4281-AE1F-4A1ED149EAD0}">
-  <ds:schemaRefs>
-    <ds:schemaRef ds:uri="http://schemas.microsoft.com/office/2006/metadata/properties"/>
-    <ds:schemaRef ds:uri="http://schemas.microsoft.com/office/infopath/2007/PartnerControls"/>
-    <ds:schemaRef ds:uri="35340a7f-ac58-4c30-95c7-c3b83052e586"/>
-    <ds:schemaRef ds:uri="beafe44e-21f3-44c4-a034-81122030d759"/>
-  </ds:schemaRefs>
-</ds:datastoreItem>
-</file>
-
 <file path=customXml/itemProps3.xml><?xml version="1.0" encoding="utf-8"?>
 <ds:datastoreItem xmlns:ds="http://schemas.openxmlformats.org/officeDocument/2006/customXml" ds:itemID="{0B2AEFC2-C078-4070-A9EB-E2A860F5E180}">
   <ds:schemaRefs>

</xml_diff>